<commit_message>
fifth commit: going to the final wave
</commit_message>
<xml_diff>
--- a/40_results/article_figures/tables/TABLE2_mincer_zarnowitz.docx
+++ b/40_results/article_figures/tables/TABLE2_mincer_zarnowitz.docx
@@ -80,7 +80,7 @@
                 <w:szCs w:val="20"/>
                 <w:color w:val="000000"/>
               </w:rPr>
-              <w:t xml:space="preserve">Table 2 - Mincer-Zarnowitz joint p-value (values &gt; 0.10 = unbiased)</w:t>
+              <w:t xml:space="preserve">Mincer-Zarnowitz joint p-value (Newey-West HAC, lag = h-1): values &gt; 0.10 = forecast efficiency not rejected</w:t>
             </w:r>
           </w:p>
         </w:tc>
@@ -368,13 +368,293 @@
       </w:tr>
       <w:tr>
         <w:trPr>
+          <w:trHeight w:val="582" w:hRule="auto"/>
+        </w:trPr>
+        <w:tc>
+          <w:tcPr>
+            <w:tcBorders>
+              <w:bottom w:val="none" w:sz="0" w:space="0" w:color="000000"/>
+              <w:top w:val="single" w:sz="12" w:space="0" w:color="666666"/>
+              <w:left w:val="none" w:sz="0" w:space="0" w:color="000000"/>
+              <w:right w:val="none" w:sz="0" w:space="0" w:color="000000"/>
+            </w:tcBorders>
+            <w:shd w:val="clear" w:color="auto" w:fill="FFFFFF"/>
+            <w:tcMar>
+              <w:top w:w="0" w:type="dxa"/>
+              <w:bottom w:w="0" w:type="dxa"/>
+              <w:left w:w="0" w:type="dxa"/>
+              <w:right w:w="0" w:type="dxa"/>
+            </w:tcMar>
+            <w:vAlign w:val="center"/>
+          </w:tcPr>
+          <w:p>
+            <w:pPr>
+              <w:pStyle w:val="Normal"/>
+              <w:jc w:val="left"/>
+              <w:pBdr>
+                <w:bottom w:val="none" w:sz="0" w:space="0" w:color="000000"/>
+                <w:top w:val="none" w:sz="0" w:space="0" w:color="000000"/>
+                <w:left w:val="none" w:sz="0" w:space="0" w:color="000000"/>
+                <w:right w:val="none" w:sz="0" w:space="0" w:color="000000"/>
+              </w:pBdr>
+              <w:spacing w:after="100" w:before="100" w:line="240"/>
+              <w:ind w:left="100" w:right="100" w:firstLine="0" w:firstLineChars="0"/>
+              <w:rPr>
+                <w:rFonts w:ascii="Calibri" w:hAnsi="Arial" w:eastAsia="Arial" w:cs="Arial"/>
+                <w:i w:val="false"/>
+                <w:b w:val="false"/>
+                <w:u w:val="none"/>
+                <w:strike w:val="false"/>
+                <w:sz w:val="20"/>
+                <w:szCs w:val="20"/>
+                <w:color w:val="000000"/>
+              </w:rPr>
+            </w:pPr>
+            <w:r>
+              <w:rPr>
+                <w:rFonts w:ascii="Calibri" w:hAnsi="Arial" w:eastAsia="Arial" w:cs="Arial"/>
+                <w:i w:val="false"/>
+                <w:b w:val="false"/>
+                <w:u w:val="none"/>
+                <w:strike w:val="false"/>
+                <w:sz w:val="20"/>
+                <w:szCs w:val="20"/>
+                <w:color w:val="000000"/>
+              </w:rPr>
+              <w:t xml:space="preserve">Ridge</w:t>
+            </w:r>
+          </w:p>
+        </w:tc>
+        <w:tc>
+          <w:tcPr>
+            <w:tcBorders>
+              <w:bottom w:val="none" w:sz="0" w:space="0" w:color="000000"/>
+              <w:top w:val="single" w:sz="12" w:space="0" w:color="666666"/>
+              <w:left w:val="none" w:sz="0" w:space="0" w:color="000000"/>
+              <w:right w:val="none" w:sz="0" w:space="0" w:color="000000"/>
+            </w:tcBorders>
+            <w:shd w:val="clear" w:color="auto" w:fill="FFFFFF"/>
+            <w:tcMar>
+              <w:top w:w="0" w:type="dxa"/>
+              <w:bottom w:w="0" w:type="dxa"/>
+              <w:left w:w="0" w:type="dxa"/>
+              <w:right w:w="0" w:type="dxa"/>
+            </w:tcMar>
+            <w:vAlign w:val="center"/>
+          </w:tcPr>
+          <w:p>
+            <w:pPr>
+              <w:pStyle w:val="Normal"/>
+              <w:jc w:val="right"/>
+              <w:pBdr>
+                <w:bottom w:val="none" w:sz="0" w:space="0" w:color="000000"/>
+                <w:top w:val="none" w:sz="0" w:space="0" w:color="000000"/>
+                <w:left w:val="none" w:sz="0" w:space="0" w:color="000000"/>
+                <w:right w:val="none" w:sz="0" w:space="0" w:color="000000"/>
+              </w:pBdr>
+              <w:spacing w:after="100" w:before="100" w:line="240"/>
+              <w:ind w:left="100" w:right="100" w:firstLine="0" w:firstLineChars="0"/>
+              <w:rPr>
+                <w:rFonts w:ascii="Calibri" w:hAnsi="Arial" w:eastAsia="Arial" w:cs="Arial"/>
+                <w:i w:val="false"/>
+                <w:b w:val="false"/>
+                <w:u w:val="none"/>
+                <w:strike w:val="false"/>
+                <w:sz w:val="20"/>
+                <w:szCs w:val="20"/>
+                <w:color w:val="000000"/>
+              </w:rPr>
+            </w:pPr>
+            <w:r>
+              <w:rPr>
+                <w:rFonts w:ascii="Calibri" w:hAnsi="Arial" w:eastAsia="Arial" w:cs="Arial"/>
+                <w:i w:val="false"/>
+                <w:b w:val="false"/>
+                <w:u w:val="none"/>
+                <w:strike w:val="false"/>
+                <w:sz w:val="20"/>
+                <w:szCs w:val="20"/>
+                <w:color w:val="000000"/>
+              </w:rPr>
+              <w:t xml:space="preserve">0.000</w:t>
+            </w:r>
+          </w:p>
+        </w:tc>
+        <w:tc>
+          <w:tcPr>
+            <w:tcBorders>
+              <w:bottom w:val="none" w:sz="0" w:space="0" w:color="000000"/>
+              <w:top w:val="single" w:sz="12" w:space="0" w:color="666666"/>
+              <w:left w:val="none" w:sz="0" w:space="0" w:color="000000"/>
+              <w:right w:val="none" w:sz="0" w:space="0" w:color="000000"/>
+            </w:tcBorders>
+            <w:shd w:val="clear" w:color="auto" w:fill="FFFFFF"/>
+            <w:tcMar>
+              <w:top w:w="0" w:type="dxa"/>
+              <w:bottom w:w="0" w:type="dxa"/>
+              <w:left w:w="0" w:type="dxa"/>
+              <w:right w:w="0" w:type="dxa"/>
+            </w:tcMar>
+            <w:vAlign w:val="center"/>
+          </w:tcPr>
+          <w:p>
+            <w:pPr>
+              <w:pStyle w:val="Normal"/>
+              <w:jc w:val="right"/>
+              <w:pBdr>
+                <w:bottom w:val="none" w:sz="0" w:space="0" w:color="000000"/>
+                <w:top w:val="none" w:sz="0" w:space="0" w:color="000000"/>
+                <w:left w:val="none" w:sz="0" w:space="0" w:color="000000"/>
+                <w:right w:val="none" w:sz="0" w:space="0" w:color="000000"/>
+              </w:pBdr>
+              <w:spacing w:after="100" w:before="100" w:line="240"/>
+              <w:ind w:left="100" w:right="100" w:firstLine="0" w:firstLineChars="0"/>
+              <w:rPr>
+                <w:rFonts w:ascii="Calibri" w:hAnsi="Arial" w:eastAsia="Arial" w:cs="Arial"/>
+                <w:i w:val="false"/>
+                <w:b w:val="false"/>
+                <w:u w:val="none"/>
+                <w:strike w:val="false"/>
+                <w:sz w:val="20"/>
+                <w:szCs w:val="20"/>
+                <w:color w:val="000000"/>
+              </w:rPr>
+            </w:pPr>
+            <w:r>
+              <w:rPr>
+                <w:rFonts w:ascii="Calibri" w:hAnsi="Arial" w:eastAsia="Arial" w:cs="Arial"/>
+                <w:i w:val="false"/>
+                <w:b w:val="false"/>
+                <w:u w:val="none"/>
+                <w:strike w:val="false"/>
+                <w:sz w:val="20"/>
+                <w:szCs w:val="20"/>
+                <w:color w:val="000000"/>
+              </w:rPr>
+              <w:t xml:space="preserve">0.000</w:t>
+            </w:r>
+          </w:p>
+        </w:tc>
+        <w:tc>
+          <w:tcPr>
+            <w:tcBorders>
+              <w:bottom w:val="none" w:sz="0" w:space="0" w:color="000000"/>
+              <w:top w:val="single" w:sz="12" w:space="0" w:color="666666"/>
+              <w:left w:val="none" w:sz="0" w:space="0" w:color="000000"/>
+              <w:right w:val="none" w:sz="0" w:space="0" w:color="000000"/>
+            </w:tcBorders>
+            <w:shd w:val="clear" w:color="auto" w:fill="FFFFFF"/>
+            <w:tcMar>
+              <w:top w:w="0" w:type="dxa"/>
+              <w:bottom w:w="0" w:type="dxa"/>
+              <w:left w:w="0" w:type="dxa"/>
+              <w:right w:w="0" w:type="dxa"/>
+            </w:tcMar>
+            <w:vAlign w:val="center"/>
+          </w:tcPr>
+          <w:p>
+            <w:pPr>
+              <w:pStyle w:val="Normal"/>
+              <w:jc w:val="right"/>
+              <w:pBdr>
+                <w:bottom w:val="none" w:sz="0" w:space="0" w:color="000000"/>
+                <w:top w:val="none" w:sz="0" w:space="0" w:color="000000"/>
+                <w:left w:val="none" w:sz="0" w:space="0" w:color="000000"/>
+                <w:right w:val="none" w:sz="0" w:space="0" w:color="000000"/>
+              </w:pBdr>
+              <w:spacing w:after="100" w:before="100" w:line="240"/>
+              <w:ind w:left="100" w:right="100" w:firstLine="0" w:firstLineChars="0"/>
+              <w:rPr>
+                <w:rFonts w:ascii="Calibri" w:hAnsi="Arial" w:eastAsia="Arial" w:cs="Arial"/>
+                <w:i w:val="false"/>
+                <w:b w:val="false"/>
+                <w:u w:val="none"/>
+                <w:strike w:val="false"/>
+                <w:sz w:val="20"/>
+                <w:szCs w:val="20"/>
+                <w:color w:val="000000"/>
+              </w:rPr>
+            </w:pPr>
+            <w:r>
+              <w:rPr>
+                <w:rFonts w:ascii="Calibri" w:hAnsi="Arial" w:eastAsia="Arial" w:cs="Arial"/>
+                <w:i w:val="false"/>
+                <w:b w:val="false"/>
+                <w:u w:val="none"/>
+                <w:strike w:val="false"/>
+                <w:sz w:val="20"/>
+                <w:szCs w:val="20"/>
+                <w:color w:val="000000"/>
+              </w:rPr>
+              <w:t xml:space="preserve">0.000</w:t>
+            </w:r>
+          </w:p>
+        </w:tc>
+        <w:tc>
+          <w:tcPr>
+            <w:tcBorders>
+              <w:bottom w:val="none" w:sz="0" w:space="0" w:color="000000"/>
+              <w:top w:val="single" w:sz="12" w:space="0" w:color="666666"/>
+              <w:left w:val="none" w:sz="0" w:space="0" w:color="000000"/>
+              <w:right w:val="none" w:sz="0" w:space="0" w:color="000000"/>
+            </w:tcBorders>
+            <w:shd w:val="clear" w:color="auto" w:fill="FFFFFF"/>
+            <w:tcMar>
+              <w:top w:w="0" w:type="dxa"/>
+              <w:bottom w:w="0" w:type="dxa"/>
+              <w:left w:w="0" w:type="dxa"/>
+              <w:right w:w="0" w:type="dxa"/>
+            </w:tcMar>
+            <w:vAlign w:val="center"/>
+          </w:tcPr>
+          <w:p>
+            <w:pPr>
+              <w:pStyle w:val="Normal"/>
+              <w:jc w:val="right"/>
+              <w:pBdr>
+                <w:bottom w:val="none" w:sz="0" w:space="0" w:color="000000"/>
+                <w:top w:val="none" w:sz="0" w:space="0" w:color="000000"/>
+                <w:left w:val="none" w:sz="0" w:space="0" w:color="000000"/>
+                <w:right w:val="none" w:sz="0" w:space="0" w:color="000000"/>
+              </w:pBdr>
+              <w:spacing w:after="100" w:before="100" w:line="240"/>
+              <w:ind w:left="100" w:right="100" w:firstLine="0" w:firstLineChars="0"/>
+              <w:rPr>
+                <w:rFonts w:ascii="Calibri" w:hAnsi="Arial" w:eastAsia="Arial" w:cs="Arial"/>
+                <w:i w:val="false"/>
+                <w:b w:val="false"/>
+                <w:u w:val="none"/>
+                <w:strike w:val="false"/>
+                <w:sz w:val="20"/>
+                <w:szCs w:val="20"/>
+                <w:color w:val="000000"/>
+              </w:rPr>
+            </w:pPr>
+            <w:r>
+              <w:rPr>
+                <w:rFonts w:ascii="Calibri" w:hAnsi="Arial" w:eastAsia="Arial" w:cs="Arial"/>
+                <w:i w:val="false"/>
+                <w:b w:val="false"/>
+                <w:u w:val="none"/>
+                <w:strike w:val="false"/>
+                <w:sz w:val="20"/>
+                <w:szCs w:val="20"/>
+                <w:color w:val="000000"/>
+              </w:rPr>
+              <w:t xml:space="preserve">0.000</w:t>
+            </w:r>
+          </w:p>
+        </w:tc>
+      </w:tr>
+      <w:tr>
+        <w:trPr>
           <w:trHeight w:val="541" w:hRule="auto"/>
         </w:trPr>
         <w:tc>
           <w:tcPr>
             <w:tcBorders>
               <w:bottom w:val="none" w:sz="0" w:space="0" w:color="000000"/>
-              <w:top w:val="single" w:sz="12" w:space="0" w:color="666666"/>
+              <w:top w:val="none" w:sz="0" w:space="0" w:color="000000"/>
               <w:left w:val="none" w:sz="0" w:space="0" w:color="000000"/>
               <w:right w:val="none" w:sz="0" w:space="0" w:color="000000"/>
             </w:tcBorders>
@@ -421,6 +701,1126 @@
                 <w:szCs w:val="20"/>
                 <w:color w:val="000000"/>
               </w:rPr>
+              <w:t xml:space="preserve">2SRR-FAVAR</w:t>
+            </w:r>
+          </w:p>
+        </w:tc>
+        <w:tc>
+          <w:tcPr>
+            <w:tcBorders>
+              <w:bottom w:val="none" w:sz="0" w:space="0" w:color="000000"/>
+              <w:top w:val="none" w:sz="0" w:space="0" w:color="000000"/>
+              <w:left w:val="none" w:sz="0" w:space="0" w:color="000000"/>
+              <w:right w:val="none" w:sz="0" w:space="0" w:color="000000"/>
+            </w:tcBorders>
+            <w:shd w:val="clear" w:color="auto" w:fill="FFFFFF"/>
+            <w:tcMar>
+              <w:top w:w="0" w:type="dxa"/>
+              <w:bottom w:w="0" w:type="dxa"/>
+              <w:left w:w="0" w:type="dxa"/>
+              <w:right w:w="0" w:type="dxa"/>
+            </w:tcMar>
+            <w:vAlign w:val="center"/>
+          </w:tcPr>
+          <w:p>
+            <w:pPr>
+              <w:pStyle w:val="Normal"/>
+              <w:jc w:val="right"/>
+              <w:pBdr>
+                <w:bottom w:val="none" w:sz="0" w:space="0" w:color="000000"/>
+                <w:top w:val="none" w:sz="0" w:space="0" w:color="000000"/>
+                <w:left w:val="none" w:sz="0" w:space="0" w:color="000000"/>
+                <w:right w:val="none" w:sz="0" w:space="0" w:color="000000"/>
+              </w:pBdr>
+              <w:spacing w:after="100" w:before="100" w:line="240"/>
+              <w:ind w:left="100" w:right="100" w:firstLine="0" w:firstLineChars="0"/>
+              <w:rPr>
+                <w:rFonts w:ascii="Calibri" w:hAnsi="Arial" w:eastAsia="Arial" w:cs="Arial"/>
+                <w:i w:val="false"/>
+                <w:b w:val="false"/>
+                <w:u w:val="none"/>
+                <w:strike w:val="false"/>
+                <w:sz w:val="20"/>
+                <w:szCs w:val="20"/>
+                <w:color w:val="000000"/>
+              </w:rPr>
+            </w:pPr>
+            <w:r>
+              <w:rPr>
+                <w:rFonts w:ascii="Calibri" w:hAnsi="Arial" w:eastAsia="Arial" w:cs="Arial"/>
+                <w:i w:val="false"/>
+                <w:b w:val="false"/>
+                <w:u w:val="none"/>
+                <w:strike w:val="false"/>
+                <w:sz w:val="20"/>
+                <w:szCs w:val="20"/>
+                <w:color w:val="000000"/>
+              </w:rPr>
+              <w:t xml:space="preserve">0.145</w:t>
+            </w:r>
+          </w:p>
+        </w:tc>
+        <w:tc>
+          <w:tcPr>
+            <w:tcBorders>
+              <w:bottom w:val="none" w:sz="0" w:space="0" w:color="000000"/>
+              <w:top w:val="none" w:sz="0" w:space="0" w:color="000000"/>
+              <w:left w:val="none" w:sz="0" w:space="0" w:color="000000"/>
+              <w:right w:val="none" w:sz="0" w:space="0" w:color="000000"/>
+            </w:tcBorders>
+            <w:shd w:val="clear" w:color="auto" w:fill="FFFFFF"/>
+            <w:tcMar>
+              <w:top w:w="0" w:type="dxa"/>
+              <w:bottom w:w="0" w:type="dxa"/>
+              <w:left w:w="0" w:type="dxa"/>
+              <w:right w:w="0" w:type="dxa"/>
+            </w:tcMar>
+            <w:vAlign w:val="center"/>
+          </w:tcPr>
+          <w:p>
+            <w:pPr>
+              <w:pStyle w:val="Normal"/>
+              <w:jc w:val="right"/>
+              <w:pBdr>
+                <w:bottom w:val="none" w:sz="0" w:space="0" w:color="000000"/>
+                <w:top w:val="none" w:sz="0" w:space="0" w:color="000000"/>
+                <w:left w:val="none" w:sz="0" w:space="0" w:color="000000"/>
+                <w:right w:val="none" w:sz="0" w:space="0" w:color="000000"/>
+              </w:pBdr>
+              <w:spacing w:after="100" w:before="100" w:line="240"/>
+              <w:ind w:left="100" w:right="100" w:firstLine="0" w:firstLineChars="0"/>
+              <w:rPr>
+                <w:rFonts w:ascii="Calibri" w:hAnsi="Arial" w:eastAsia="Arial" w:cs="Arial"/>
+                <w:i w:val="false"/>
+                <w:b w:val="false"/>
+                <w:u w:val="none"/>
+                <w:strike w:val="false"/>
+                <w:sz w:val="20"/>
+                <w:szCs w:val="20"/>
+                <w:color w:val="000000"/>
+              </w:rPr>
+            </w:pPr>
+            <w:r>
+              <w:rPr>
+                <w:rFonts w:ascii="Calibri" w:hAnsi="Arial" w:eastAsia="Arial" w:cs="Arial"/>
+                <w:i w:val="false"/>
+                <w:b w:val="false"/>
+                <w:u w:val="none"/>
+                <w:strike w:val="false"/>
+                <w:sz w:val="20"/>
+                <w:szCs w:val="20"/>
+                <w:color w:val="000000"/>
+              </w:rPr>
+              <w:t xml:space="preserve">0.501</w:t>
+            </w:r>
+          </w:p>
+        </w:tc>
+        <w:tc>
+          <w:tcPr>
+            <w:tcBorders>
+              <w:bottom w:val="none" w:sz="0" w:space="0" w:color="000000"/>
+              <w:top w:val="none" w:sz="0" w:space="0" w:color="000000"/>
+              <w:left w:val="none" w:sz="0" w:space="0" w:color="000000"/>
+              <w:right w:val="none" w:sz="0" w:space="0" w:color="000000"/>
+            </w:tcBorders>
+            <w:shd w:val="clear" w:color="auto" w:fill="FFFFFF"/>
+            <w:tcMar>
+              <w:top w:w="0" w:type="dxa"/>
+              <w:bottom w:w="0" w:type="dxa"/>
+              <w:left w:w="0" w:type="dxa"/>
+              <w:right w:w="0" w:type="dxa"/>
+            </w:tcMar>
+            <w:vAlign w:val="center"/>
+          </w:tcPr>
+          <w:p>
+            <w:pPr>
+              <w:pStyle w:val="Normal"/>
+              <w:jc w:val="right"/>
+              <w:pBdr>
+                <w:bottom w:val="none" w:sz="0" w:space="0" w:color="000000"/>
+                <w:top w:val="none" w:sz="0" w:space="0" w:color="000000"/>
+                <w:left w:val="none" w:sz="0" w:space="0" w:color="000000"/>
+                <w:right w:val="none" w:sz="0" w:space="0" w:color="000000"/>
+              </w:pBdr>
+              <w:spacing w:after="100" w:before="100" w:line="240"/>
+              <w:ind w:left="100" w:right="100" w:firstLine="0" w:firstLineChars="0"/>
+              <w:rPr>
+                <w:rFonts w:ascii="Calibri" w:hAnsi="Arial" w:eastAsia="Arial" w:cs="Arial"/>
+                <w:i w:val="false"/>
+                <w:b w:val="false"/>
+                <w:u w:val="none"/>
+                <w:strike w:val="false"/>
+                <w:sz w:val="20"/>
+                <w:szCs w:val="20"/>
+                <w:color w:val="000000"/>
+              </w:rPr>
+            </w:pPr>
+            <w:r>
+              <w:rPr>
+                <w:rFonts w:ascii="Calibri" w:hAnsi="Arial" w:eastAsia="Arial" w:cs="Arial"/>
+                <w:i w:val="false"/>
+                <w:b w:val="false"/>
+                <w:u w:val="none"/>
+                <w:strike w:val="false"/>
+                <w:sz w:val="20"/>
+                <w:szCs w:val="20"/>
+                <w:color w:val="000000"/>
+              </w:rPr>
+              <w:t xml:space="preserve">0.306</w:t>
+            </w:r>
+          </w:p>
+        </w:tc>
+        <w:tc>
+          <w:tcPr>
+            <w:tcBorders>
+              <w:bottom w:val="none" w:sz="0" w:space="0" w:color="000000"/>
+              <w:top w:val="none" w:sz="0" w:space="0" w:color="000000"/>
+              <w:left w:val="none" w:sz="0" w:space="0" w:color="000000"/>
+              <w:right w:val="none" w:sz="0" w:space="0" w:color="000000"/>
+            </w:tcBorders>
+            <w:shd w:val="clear" w:color="auto" w:fill="FFFFFF"/>
+            <w:tcMar>
+              <w:top w:w="0" w:type="dxa"/>
+              <w:bottom w:w="0" w:type="dxa"/>
+              <w:left w:w="0" w:type="dxa"/>
+              <w:right w:w="0" w:type="dxa"/>
+            </w:tcMar>
+            <w:vAlign w:val="center"/>
+          </w:tcPr>
+          <w:p>
+            <w:pPr>
+              <w:pStyle w:val="Normal"/>
+              <w:jc w:val="right"/>
+              <w:pBdr>
+                <w:bottom w:val="none" w:sz="0" w:space="0" w:color="000000"/>
+                <w:top w:val="none" w:sz="0" w:space="0" w:color="000000"/>
+                <w:left w:val="none" w:sz="0" w:space="0" w:color="000000"/>
+                <w:right w:val="none" w:sz="0" w:space="0" w:color="000000"/>
+              </w:pBdr>
+              <w:spacing w:after="100" w:before="100" w:line="240"/>
+              <w:ind w:left="100" w:right="100" w:firstLine="0" w:firstLineChars="0"/>
+              <w:rPr>
+                <w:rFonts w:ascii="Calibri" w:hAnsi="Arial" w:eastAsia="Arial" w:cs="Arial"/>
+                <w:i w:val="false"/>
+                <w:b w:val="false"/>
+                <w:u w:val="none"/>
+                <w:strike w:val="false"/>
+                <w:sz w:val="20"/>
+                <w:szCs w:val="20"/>
+                <w:color w:val="000000"/>
+              </w:rPr>
+            </w:pPr>
+            <w:r>
+              <w:rPr>
+                <w:rFonts w:ascii="Calibri" w:hAnsi="Arial" w:eastAsia="Arial" w:cs="Arial"/>
+                <w:i w:val="false"/>
+                <w:b w:val="false"/>
+                <w:u w:val="none"/>
+                <w:strike w:val="false"/>
+                <w:sz w:val="20"/>
+                <w:szCs w:val="20"/>
+                <w:color w:val="000000"/>
+              </w:rPr>
+              <w:t xml:space="preserve">0.073</w:t>
+            </w:r>
+          </w:p>
+        </w:tc>
+      </w:tr>
+      <w:tr>
+        <w:trPr>
+          <w:trHeight w:val="541" w:hRule="auto"/>
+        </w:trPr>
+        <w:tc>
+          <w:tcPr>
+            <w:tcBorders>
+              <w:bottom w:val="none" w:sz="0" w:space="0" w:color="000000"/>
+              <w:top w:val="none" w:sz="0" w:space="0" w:color="000000"/>
+              <w:left w:val="none" w:sz="0" w:space="0" w:color="000000"/>
+              <w:right w:val="none" w:sz="0" w:space="0" w:color="000000"/>
+            </w:tcBorders>
+            <w:shd w:val="clear" w:color="auto" w:fill="FFFFFF"/>
+            <w:tcMar>
+              <w:top w:w="0" w:type="dxa"/>
+              <w:bottom w:w="0" w:type="dxa"/>
+              <w:left w:w="0" w:type="dxa"/>
+              <w:right w:w="0" w:type="dxa"/>
+            </w:tcMar>
+            <w:vAlign w:val="center"/>
+          </w:tcPr>
+          <w:p>
+            <w:pPr>
+              <w:pStyle w:val="Normal"/>
+              <w:jc w:val="left"/>
+              <w:pBdr>
+                <w:bottom w:val="none" w:sz="0" w:space="0" w:color="000000"/>
+                <w:top w:val="none" w:sz="0" w:space="0" w:color="000000"/>
+                <w:left w:val="none" w:sz="0" w:space="0" w:color="000000"/>
+                <w:right w:val="none" w:sz="0" w:space="0" w:color="000000"/>
+              </w:pBdr>
+              <w:spacing w:after="100" w:before="100" w:line="240"/>
+              <w:ind w:left="100" w:right="100" w:firstLine="0" w:firstLineChars="0"/>
+              <w:rPr>
+                <w:rFonts w:ascii="Calibri" w:hAnsi="Arial" w:eastAsia="Arial" w:cs="Arial"/>
+                <w:i w:val="false"/>
+                <w:b w:val="false"/>
+                <w:u w:val="none"/>
+                <w:strike w:val="false"/>
+                <w:sz w:val="20"/>
+                <w:szCs w:val="20"/>
+                <w:color w:val="000000"/>
+              </w:rPr>
+            </w:pPr>
+            <w:r>
+              <w:rPr>
+                <w:rFonts w:ascii="Calibri" w:hAnsi="Arial" w:eastAsia="Arial" w:cs="Arial"/>
+                <w:i w:val="false"/>
+                <w:b w:val="false"/>
+                <w:u w:val="none"/>
+                <w:strike w:val="false"/>
+                <w:sz w:val="20"/>
+                <w:szCs w:val="20"/>
+                <w:color w:val="000000"/>
+              </w:rPr>
+              <w:t xml:space="preserve">2SRR-Factor</w:t>
+            </w:r>
+          </w:p>
+        </w:tc>
+        <w:tc>
+          <w:tcPr>
+            <w:tcBorders>
+              <w:bottom w:val="none" w:sz="0" w:space="0" w:color="000000"/>
+              <w:top w:val="none" w:sz="0" w:space="0" w:color="000000"/>
+              <w:left w:val="none" w:sz="0" w:space="0" w:color="000000"/>
+              <w:right w:val="none" w:sz="0" w:space="0" w:color="000000"/>
+            </w:tcBorders>
+            <w:shd w:val="clear" w:color="auto" w:fill="FFFFFF"/>
+            <w:tcMar>
+              <w:top w:w="0" w:type="dxa"/>
+              <w:bottom w:w="0" w:type="dxa"/>
+              <w:left w:w="0" w:type="dxa"/>
+              <w:right w:w="0" w:type="dxa"/>
+            </w:tcMar>
+            <w:vAlign w:val="center"/>
+          </w:tcPr>
+          <w:p>
+            <w:pPr>
+              <w:pStyle w:val="Normal"/>
+              <w:jc w:val="right"/>
+              <w:pBdr>
+                <w:bottom w:val="none" w:sz="0" w:space="0" w:color="000000"/>
+                <w:top w:val="none" w:sz="0" w:space="0" w:color="000000"/>
+                <w:left w:val="none" w:sz="0" w:space="0" w:color="000000"/>
+                <w:right w:val="none" w:sz="0" w:space="0" w:color="000000"/>
+              </w:pBdr>
+              <w:spacing w:after="100" w:before="100" w:line="240"/>
+              <w:ind w:left="100" w:right="100" w:firstLine="0" w:firstLineChars="0"/>
+              <w:rPr>
+                <w:rFonts w:ascii="Calibri" w:hAnsi="Arial" w:eastAsia="Arial" w:cs="Arial"/>
+                <w:i w:val="false"/>
+                <w:b w:val="false"/>
+                <w:u w:val="none"/>
+                <w:strike w:val="false"/>
+                <w:sz w:val="20"/>
+                <w:szCs w:val="20"/>
+                <w:color w:val="000000"/>
+              </w:rPr>
+            </w:pPr>
+            <w:r>
+              <w:rPr>
+                <w:rFonts w:ascii="Calibri" w:hAnsi="Arial" w:eastAsia="Arial" w:cs="Arial"/>
+                <w:i w:val="false"/>
+                <w:b w:val="false"/>
+                <w:u w:val="none"/>
+                <w:strike w:val="false"/>
+                <w:sz w:val="20"/>
+                <w:szCs w:val="20"/>
+                <w:color w:val="000000"/>
+              </w:rPr>
+              <w:t xml:space="preserve">0.160</w:t>
+            </w:r>
+          </w:p>
+        </w:tc>
+        <w:tc>
+          <w:tcPr>
+            <w:tcBorders>
+              <w:bottom w:val="none" w:sz="0" w:space="0" w:color="000000"/>
+              <w:top w:val="none" w:sz="0" w:space="0" w:color="000000"/>
+              <w:left w:val="none" w:sz="0" w:space="0" w:color="000000"/>
+              <w:right w:val="none" w:sz="0" w:space="0" w:color="000000"/>
+            </w:tcBorders>
+            <w:shd w:val="clear" w:color="auto" w:fill="FFFFFF"/>
+            <w:tcMar>
+              <w:top w:w="0" w:type="dxa"/>
+              <w:bottom w:w="0" w:type="dxa"/>
+              <w:left w:w="0" w:type="dxa"/>
+              <w:right w:w="0" w:type="dxa"/>
+            </w:tcMar>
+            <w:vAlign w:val="center"/>
+          </w:tcPr>
+          <w:p>
+            <w:pPr>
+              <w:pStyle w:val="Normal"/>
+              <w:jc w:val="right"/>
+              <w:pBdr>
+                <w:bottom w:val="none" w:sz="0" w:space="0" w:color="000000"/>
+                <w:top w:val="none" w:sz="0" w:space="0" w:color="000000"/>
+                <w:left w:val="none" w:sz="0" w:space="0" w:color="000000"/>
+                <w:right w:val="none" w:sz="0" w:space="0" w:color="000000"/>
+              </w:pBdr>
+              <w:spacing w:after="100" w:before="100" w:line="240"/>
+              <w:ind w:left="100" w:right="100" w:firstLine="0" w:firstLineChars="0"/>
+              <w:rPr>
+                <w:rFonts w:ascii="Calibri" w:hAnsi="Arial" w:eastAsia="Arial" w:cs="Arial"/>
+                <w:i w:val="false"/>
+                <w:b w:val="false"/>
+                <w:u w:val="none"/>
+                <w:strike w:val="false"/>
+                <w:sz w:val="20"/>
+                <w:szCs w:val="20"/>
+                <w:color w:val="000000"/>
+              </w:rPr>
+            </w:pPr>
+            <w:r>
+              <w:rPr>
+                <w:rFonts w:ascii="Calibri" w:hAnsi="Arial" w:eastAsia="Arial" w:cs="Arial"/>
+                <w:i w:val="false"/>
+                <w:b w:val="false"/>
+                <w:u w:val="none"/>
+                <w:strike w:val="false"/>
+                <w:sz w:val="20"/>
+                <w:szCs w:val="20"/>
+                <w:color w:val="000000"/>
+              </w:rPr>
+              <w:t xml:space="preserve">0.210</w:t>
+            </w:r>
+          </w:p>
+        </w:tc>
+        <w:tc>
+          <w:tcPr>
+            <w:tcBorders>
+              <w:bottom w:val="none" w:sz="0" w:space="0" w:color="000000"/>
+              <w:top w:val="none" w:sz="0" w:space="0" w:color="000000"/>
+              <w:left w:val="none" w:sz="0" w:space="0" w:color="000000"/>
+              <w:right w:val="none" w:sz="0" w:space="0" w:color="000000"/>
+            </w:tcBorders>
+            <w:shd w:val="clear" w:color="auto" w:fill="FFFFFF"/>
+            <w:tcMar>
+              <w:top w:w="0" w:type="dxa"/>
+              <w:bottom w:w="0" w:type="dxa"/>
+              <w:left w:w="0" w:type="dxa"/>
+              <w:right w:w="0" w:type="dxa"/>
+            </w:tcMar>
+            <w:vAlign w:val="center"/>
+          </w:tcPr>
+          <w:p>
+            <w:pPr>
+              <w:pStyle w:val="Normal"/>
+              <w:jc w:val="right"/>
+              <w:pBdr>
+                <w:bottom w:val="none" w:sz="0" w:space="0" w:color="000000"/>
+                <w:top w:val="none" w:sz="0" w:space="0" w:color="000000"/>
+                <w:left w:val="none" w:sz="0" w:space="0" w:color="000000"/>
+                <w:right w:val="none" w:sz="0" w:space="0" w:color="000000"/>
+              </w:pBdr>
+              <w:spacing w:after="100" w:before="100" w:line="240"/>
+              <w:ind w:left="100" w:right="100" w:firstLine="0" w:firstLineChars="0"/>
+              <w:rPr>
+                <w:rFonts w:ascii="Calibri" w:hAnsi="Arial" w:eastAsia="Arial" w:cs="Arial"/>
+                <w:i w:val="false"/>
+                <w:b w:val="false"/>
+                <w:u w:val="none"/>
+                <w:strike w:val="false"/>
+                <w:sz w:val="20"/>
+                <w:szCs w:val="20"/>
+                <w:color w:val="000000"/>
+              </w:rPr>
+            </w:pPr>
+            <w:r>
+              <w:rPr>
+                <w:rFonts w:ascii="Calibri" w:hAnsi="Arial" w:eastAsia="Arial" w:cs="Arial"/>
+                <w:i w:val="false"/>
+                <w:b w:val="false"/>
+                <w:u w:val="none"/>
+                <w:strike w:val="false"/>
+                <w:sz w:val="20"/>
+                <w:szCs w:val="20"/>
+                <w:color w:val="000000"/>
+              </w:rPr>
+              <w:t xml:space="preserve">0.338</w:t>
+            </w:r>
+          </w:p>
+        </w:tc>
+        <w:tc>
+          <w:tcPr>
+            <w:tcBorders>
+              <w:bottom w:val="none" w:sz="0" w:space="0" w:color="000000"/>
+              <w:top w:val="none" w:sz="0" w:space="0" w:color="000000"/>
+              <w:left w:val="none" w:sz="0" w:space="0" w:color="000000"/>
+              <w:right w:val="none" w:sz="0" w:space="0" w:color="000000"/>
+            </w:tcBorders>
+            <w:shd w:val="clear" w:color="auto" w:fill="FFFFFF"/>
+            <w:tcMar>
+              <w:top w:w="0" w:type="dxa"/>
+              <w:bottom w:w="0" w:type="dxa"/>
+              <w:left w:w="0" w:type="dxa"/>
+              <w:right w:w="0" w:type="dxa"/>
+            </w:tcMar>
+            <w:vAlign w:val="center"/>
+          </w:tcPr>
+          <w:p>
+            <w:pPr>
+              <w:pStyle w:val="Normal"/>
+              <w:jc w:val="right"/>
+              <w:pBdr>
+                <w:bottom w:val="none" w:sz="0" w:space="0" w:color="000000"/>
+                <w:top w:val="none" w:sz="0" w:space="0" w:color="000000"/>
+                <w:left w:val="none" w:sz="0" w:space="0" w:color="000000"/>
+                <w:right w:val="none" w:sz="0" w:space="0" w:color="000000"/>
+              </w:pBdr>
+              <w:spacing w:after="100" w:before="100" w:line="240"/>
+              <w:ind w:left="100" w:right="100" w:firstLine="0" w:firstLineChars="0"/>
+              <w:rPr>
+                <w:rFonts w:ascii="Calibri" w:hAnsi="Arial" w:eastAsia="Arial" w:cs="Arial"/>
+                <w:i w:val="false"/>
+                <w:b w:val="false"/>
+                <w:u w:val="none"/>
+                <w:strike w:val="false"/>
+                <w:sz w:val="20"/>
+                <w:szCs w:val="20"/>
+                <w:color w:val="000000"/>
+              </w:rPr>
+            </w:pPr>
+            <w:r>
+              <w:rPr>
+                <w:rFonts w:ascii="Calibri" w:hAnsi="Arial" w:eastAsia="Arial" w:cs="Arial"/>
+                <w:i w:val="false"/>
+                <w:b w:val="false"/>
+                <w:u w:val="none"/>
+                <w:strike w:val="false"/>
+                <w:sz w:val="20"/>
+                <w:szCs w:val="20"/>
+                <w:color w:val="000000"/>
+              </w:rPr>
+              <w:t xml:space="preserve">0.700</w:t>
+            </w:r>
+          </w:p>
+        </w:tc>
+      </w:tr>
+      <w:tr>
+        <w:trPr>
+          <w:trHeight w:val="541" w:hRule="auto"/>
+        </w:trPr>
+        <w:tc>
+          <w:tcPr>
+            <w:tcBorders>
+              <w:bottom w:val="none" w:sz="0" w:space="0" w:color="000000"/>
+              <w:top w:val="none" w:sz="0" w:space="0" w:color="000000"/>
+              <w:left w:val="none" w:sz="0" w:space="0" w:color="000000"/>
+              <w:right w:val="none" w:sz="0" w:space="0" w:color="000000"/>
+            </w:tcBorders>
+            <w:shd w:val="clear" w:color="auto" w:fill="FFFFFF"/>
+            <w:tcMar>
+              <w:top w:w="0" w:type="dxa"/>
+              <w:bottom w:w="0" w:type="dxa"/>
+              <w:left w:w="0" w:type="dxa"/>
+              <w:right w:w="0" w:type="dxa"/>
+            </w:tcMar>
+            <w:vAlign w:val="center"/>
+          </w:tcPr>
+          <w:p>
+            <w:pPr>
+              <w:pStyle w:val="Normal"/>
+              <w:jc w:val="left"/>
+              <w:pBdr>
+                <w:bottom w:val="none" w:sz="0" w:space="0" w:color="000000"/>
+                <w:top w:val="none" w:sz="0" w:space="0" w:color="000000"/>
+                <w:left w:val="none" w:sz="0" w:space="0" w:color="000000"/>
+                <w:right w:val="none" w:sz="0" w:space="0" w:color="000000"/>
+              </w:pBdr>
+              <w:spacing w:after="100" w:before="100" w:line="240"/>
+              <w:ind w:left="100" w:right="100" w:firstLine="0" w:firstLineChars="0"/>
+              <w:rPr>
+                <w:rFonts w:ascii="Calibri" w:hAnsi="Arial" w:eastAsia="Arial" w:cs="Arial"/>
+                <w:i w:val="false"/>
+                <w:b w:val="false"/>
+                <w:u w:val="none"/>
+                <w:strike w:val="false"/>
+                <w:sz w:val="20"/>
+                <w:szCs w:val="20"/>
+                <w:color w:val="000000"/>
+              </w:rPr>
+            </w:pPr>
+            <w:r>
+              <w:rPr>
+                <w:rFonts w:ascii="Calibri" w:hAnsi="Arial" w:eastAsia="Arial" w:cs="Arial"/>
+                <w:i w:val="false"/>
+                <w:b w:val="false"/>
+                <w:u w:val="none"/>
+                <w:strike w:val="false"/>
+                <w:sz w:val="20"/>
+                <w:szCs w:val="20"/>
+                <w:color w:val="000000"/>
+              </w:rPr>
+              <w:t xml:space="preserve">2SRR-AR</w:t>
+            </w:r>
+          </w:p>
+        </w:tc>
+        <w:tc>
+          <w:tcPr>
+            <w:tcBorders>
+              <w:bottom w:val="none" w:sz="0" w:space="0" w:color="000000"/>
+              <w:top w:val="none" w:sz="0" w:space="0" w:color="000000"/>
+              <w:left w:val="none" w:sz="0" w:space="0" w:color="000000"/>
+              <w:right w:val="none" w:sz="0" w:space="0" w:color="000000"/>
+            </w:tcBorders>
+            <w:shd w:val="clear" w:color="auto" w:fill="FFFFFF"/>
+            <w:tcMar>
+              <w:top w:w="0" w:type="dxa"/>
+              <w:bottom w:w="0" w:type="dxa"/>
+              <w:left w:w="0" w:type="dxa"/>
+              <w:right w:w="0" w:type="dxa"/>
+            </w:tcMar>
+            <w:vAlign w:val="center"/>
+          </w:tcPr>
+          <w:p>
+            <w:pPr>
+              <w:pStyle w:val="Normal"/>
+              <w:jc w:val="right"/>
+              <w:pBdr>
+                <w:bottom w:val="none" w:sz="0" w:space="0" w:color="000000"/>
+                <w:top w:val="none" w:sz="0" w:space="0" w:color="000000"/>
+                <w:left w:val="none" w:sz="0" w:space="0" w:color="000000"/>
+                <w:right w:val="none" w:sz="0" w:space="0" w:color="000000"/>
+              </w:pBdr>
+              <w:spacing w:after="100" w:before="100" w:line="240"/>
+              <w:ind w:left="100" w:right="100" w:firstLine="0" w:firstLineChars="0"/>
+              <w:rPr>
+                <w:rFonts w:ascii="Calibri" w:hAnsi="Arial" w:eastAsia="Arial" w:cs="Arial"/>
+                <w:i w:val="false"/>
+                <w:b w:val="false"/>
+                <w:u w:val="none"/>
+                <w:strike w:val="false"/>
+                <w:sz w:val="20"/>
+                <w:szCs w:val="20"/>
+                <w:color w:val="000000"/>
+              </w:rPr>
+            </w:pPr>
+            <w:r>
+              <w:rPr>
+                <w:rFonts w:ascii="Calibri" w:hAnsi="Arial" w:eastAsia="Arial" w:cs="Arial"/>
+                <w:i w:val="false"/>
+                <w:b w:val="false"/>
+                <w:u w:val="none"/>
+                <w:strike w:val="false"/>
+                <w:sz w:val="20"/>
+                <w:szCs w:val="20"/>
+                <w:color w:val="000000"/>
+              </w:rPr>
+              <w:t xml:space="preserve">0.625</w:t>
+            </w:r>
+          </w:p>
+        </w:tc>
+        <w:tc>
+          <w:tcPr>
+            <w:tcBorders>
+              <w:bottom w:val="none" w:sz="0" w:space="0" w:color="000000"/>
+              <w:top w:val="none" w:sz="0" w:space="0" w:color="000000"/>
+              <w:left w:val="none" w:sz="0" w:space="0" w:color="000000"/>
+              <w:right w:val="none" w:sz="0" w:space="0" w:color="000000"/>
+            </w:tcBorders>
+            <w:shd w:val="clear" w:color="auto" w:fill="FFFFFF"/>
+            <w:tcMar>
+              <w:top w:w="0" w:type="dxa"/>
+              <w:bottom w:w="0" w:type="dxa"/>
+              <w:left w:w="0" w:type="dxa"/>
+              <w:right w:w="0" w:type="dxa"/>
+            </w:tcMar>
+            <w:vAlign w:val="center"/>
+          </w:tcPr>
+          <w:p>
+            <w:pPr>
+              <w:pStyle w:val="Normal"/>
+              <w:jc w:val="right"/>
+              <w:pBdr>
+                <w:bottom w:val="none" w:sz="0" w:space="0" w:color="000000"/>
+                <w:top w:val="none" w:sz="0" w:space="0" w:color="000000"/>
+                <w:left w:val="none" w:sz="0" w:space="0" w:color="000000"/>
+                <w:right w:val="none" w:sz="0" w:space="0" w:color="000000"/>
+              </w:pBdr>
+              <w:spacing w:after="100" w:before="100" w:line="240"/>
+              <w:ind w:left="100" w:right="100" w:firstLine="0" w:firstLineChars="0"/>
+              <w:rPr>
+                <w:rFonts w:ascii="Calibri" w:hAnsi="Arial" w:eastAsia="Arial" w:cs="Arial"/>
+                <w:i w:val="false"/>
+                <w:b w:val="false"/>
+                <w:u w:val="none"/>
+                <w:strike w:val="false"/>
+                <w:sz w:val="20"/>
+                <w:szCs w:val="20"/>
+                <w:color w:val="000000"/>
+              </w:rPr>
+            </w:pPr>
+            <w:r>
+              <w:rPr>
+                <w:rFonts w:ascii="Calibri" w:hAnsi="Arial" w:eastAsia="Arial" w:cs="Arial"/>
+                <w:i w:val="false"/>
+                <w:b w:val="false"/>
+                <w:u w:val="none"/>
+                <w:strike w:val="false"/>
+                <w:sz w:val="20"/>
+                <w:szCs w:val="20"/>
+                <w:color w:val="000000"/>
+              </w:rPr>
+              <w:t xml:space="preserve">0.584</w:t>
+            </w:r>
+          </w:p>
+        </w:tc>
+        <w:tc>
+          <w:tcPr>
+            <w:tcBorders>
+              <w:bottom w:val="none" w:sz="0" w:space="0" w:color="000000"/>
+              <w:top w:val="none" w:sz="0" w:space="0" w:color="000000"/>
+              <w:left w:val="none" w:sz="0" w:space="0" w:color="000000"/>
+              <w:right w:val="none" w:sz="0" w:space="0" w:color="000000"/>
+            </w:tcBorders>
+            <w:shd w:val="clear" w:color="auto" w:fill="FFFFFF"/>
+            <w:tcMar>
+              <w:top w:w="0" w:type="dxa"/>
+              <w:bottom w:w="0" w:type="dxa"/>
+              <w:left w:w="0" w:type="dxa"/>
+              <w:right w:w="0" w:type="dxa"/>
+            </w:tcMar>
+            <w:vAlign w:val="center"/>
+          </w:tcPr>
+          <w:p>
+            <w:pPr>
+              <w:pStyle w:val="Normal"/>
+              <w:jc w:val="right"/>
+              <w:pBdr>
+                <w:bottom w:val="none" w:sz="0" w:space="0" w:color="000000"/>
+                <w:top w:val="none" w:sz="0" w:space="0" w:color="000000"/>
+                <w:left w:val="none" w:sz="0" w:space="0" w:color="000000"/>
+                <w:right w:val="none" w:sz="0" w:space="0" w:color="000000"/>
+              </w:pBdr>
+              <w:spacing w:after="100" w:before="100" w:line="240"/>
+              <w:ind w:left="100" w:right="100" w:firstLine="0" w:firstLineChars="0"/>
+              <w:rPr>
+                <w:rFonts w:ascii="Calibri" w:hAnsi="Arial" w:eastAsia="Arial" w:cs="Arial"/>
+                <w:i w:val="false"/>
+                <w:b w:val="false"/>
+                <w:u w:val="none"/>
+                <w:strike w:val="false"/>
+                <w:sz w:val="20"/>
+                <w:szCs w:val="20"/>
+                <w:color w:val="000000"/>
+              </w:rPr>
+            </w:pPr>
+            <w:r>
+              <w:rPr>
+                <w:rFonts w:ascii="Calibri" w:hAnsi="Arial" w:eastAsia="Arial" w:cs="Arial"/>
+                <w:i w:val="false"/>
+                <w:b w:val="false"/>
+                <w:u w:val="none"/>
+                <w:strike w:val="false"/>
+                <w:sz w:val="20"/>
+                <w:szCs w:val="20"/>
+                <w:color w:val="000000"/>
+              </w:rPr>
+              <w:t xml:space="preserve">0.646</w:t>
+            </w:r>
+          </w:p>
+        </w:tc>
+        <w:tc>
+          <w:tcPr>
+            <w:tcBorders>
+              <w:bottom w:val="none" w:sz="0" w:space="0" w:color="000000"/>
+              <w:top w:val="none" w:sz="0" w:space="0" w:color="000000"/>
+              <w:left w:val="none" w:sz="0" w:space="0" w:color="000000"/>
+              <w:right w:val="none" w:sz="0" w:space="0" w:color="000000"/>
+            </w:tcBorders>
+            <w:shd w:val="clear" w:color="auto" w:fill="FFFFFF"/>
+            <w:tcMar>
+              <w:top w:w="0" w:type="dxa"/>
+              <w:bottom w:w="0" w:type="dxa"/>
+              <w:left w:w="0" w:type="dxa"/>
+              <w:right w:w="0" w:type="dxa"/>
+            </w:tcMar>
+            <w:vAlign w:val="center"/>
+          </w:tcPr>
+          <w:p>
+            <w:pPr>
+              <w:pStyle w:val="Normal"/>
+              <w:jc w:val="right"/>
+              <w:pBdr>
+                <w:bottom w:val="none" w:sz="0" w:space="0" w:color="000000"/>
+                <w:top w:val="none" w:sz="0" w:space="0" w:color="000000"/>
+                <w:left w:val="none" w:sz="0" w:space="0" w:color="000000"/>
+                <w:right w:val="none" w:sz="0" w:space="0" w:color="000000"/>
+              </w:pBdr>
+              <w:spacing w:after="100" w:before="100" w:line="240"/>
+              <w:ind w:left="100" w:right="100" w:firstLine="0" w:firstLineChars="0"/>
+              <w:rPr>
+                <w:rFonts w:ascii="Calibri" w:hAnsi="Arial" w:eastAsia="Arial" w:cs="Arial"/>
+                <w:i w:val="false"/>
+                <w:b w:val="false"/>
+                <w:u w:val="none"/>
+                <w:strike w:val="false"/>
+                <w:sz w:val="20"/>
+                <w:szCs w:val="20"/>
+                <w:color w:val="000000"/>
+              </w:rPr>
+            </w:pPr>
+            <w:r>
+              <w:rPr>
+                <w:rFonts w:ascii="Calibri" w:hAnsi="Arial" w:eastAsia="Arial" w:cs="Arial"/>
+                <w:i w:val="false"/>
+                <w:b w:val="false"/>
+                <w:u w:val="none"/>
+                <w:strike w:val="false"/>
+                <w:sz w:val="20"/>
+                <w:szCs w:val="20"/>
+                <w:color w:val="000000"/>
+              </w:rPr>
+              <w:t xml:space="preserve">0.146</w:t>
+            </w:r>
+          </w:p>
+        </w:tc>
+      </w:tr>
+      <w:tr>
+        <w:trPr>
+          <w:trHeight w:val="548" w:hRule="auto"/>
+        </w:trPr>
+        <w:tc>
+          <w:tcPr>
+            <w:tcBorders>
+              <w:bottom w:val="none" w:sz="0" w:space="0" w:color="000000"/>
+              <w:top w:val="none" w:sz="0" w:space="0" w:color="000000"/>
+              <w:left w:val="none" w:sz="0" w:space="0" w:color="000000"/>
+              <w:right w:val="none" w:sz="0" w:space="0" w:color="000000"/>
+            </w:tcBorders>
+            <w:shd w:val="clear" w:color="auto" w:fill="FFFFFF"/>
+            <w:tcMar>
+              <w:top w:w="0" w:type="dxa"/>
+              <w:bottom w:w="0" w:type="dxa"/>
+              <w:left w:w="0" w:type="dxa"/>
+              <w:right w:w="0" w:type="dxa"/>
+            </w:tcMar>
+            <w:vAlign w:val="center"/>
+          </w:tcPr>
+          <w:p>
+            <w:pPr>
+              <w:pStyle w:val="Normal"/>
+              <w:jc w:val="left"/>
+              <w:pBdr>
+                <w:bottom w:val="none" w:sz="0" w:space="0" w:color="000000"/>
+                <w:top w:val="none" w:sz="0" w:space="0" w:color="000000"/>
+                <w:left w:val="none" w:sz="0" w:space="0" w:color="000000"/>
+                <w:right w:val="none" w:sz="0" w:space="0" w:color="000000"/>
+              </w:pBdr>
+              <w:spacing w:after="100" w:before="100" w:line="240"/>
+              <w:ind w:left="100" w:right="100" w:firstLine="0" w:firstLineChars="0"/>
+              <w:rPr>
+                <w:rFonts w:ascii="Calibri" w:hAnsi="Arial" w:eastAsia="Arial" w:cs="Arial"/>
+                <w:i w:val="false"/>
+                <w:b w:val="false"/>
+                <w:u w:val="none"/>
+                <w:strike w:val="false"/>
+                <w:sz w:val="20"/>
+                <w:szCs w:val="20"/>
+                <w:color w:val="000000"/>
+              </w:rPr>
+            </w:pPr>
+            <w:r>
+              <w:rPr>
+                <w:rFonts w:ascii="Calibri" w:hAnsi="Arial" w:eastAsia="Arial" w:cs="Arial"/>
+                <w:i w:val="false"/>
+                <w:b w:val="false"/>
+                <w:u w:val="none"/>
+                <w:strike w:val="false"/>
+                <w:sz w:val="20"/>
+                <w:szCs w:val="20"/>
+                <w:color w:val="000000"/>
+              </w:rPr>
+              <w:t xml:space="preserve">Random Forest</w:t>
+            </w:r>
+          </w:p>
+        </w:tc>
+        <w:tc>
+          <w:tcPr>
+            <w:tcBorders>
+              <w:bottom w:val="none" w:sz="0" w:space="0" w:color="000000"/>
+              <w:top w:val="none" w:sz="0" w:space="0" w:color="000000"/>
+              <w:left w:val="none" w:sz="0" w:space="0" w:color="000000"/>
+              <w:right w:val="none" w:sz="0" w:space="0" w:color="000000"/>
+            </w:tcBorders>
+            <w:shd w:val="clear" w:color="auto" w:fill="FFFFFF"/>
+            <w:tcMar>
+              <w:top w:w="0" w:type="dxa"/>
+              <w:bottom w:w="0" w:type="dxa"/>
+              <w:left w:w="0" w:type="dxa"/>
+              <w:right w:w="0" w:type="dxa"/>
+            </w:tcMar>
+            <w:vAlign w:val="center"/>
+          </w:tcPr>
+          <w:p>
+            <w:pPr>
+              <w:pStyle w:val="Normal"/>
+              <w:jc w:val="right"/>
+              <w:pBdr>
+                <w:bottom w:val="none" w:sz="0" w:space="0" w:color="000000"/>
+                <w:top w:val="none" w:sz="0" w:space="0" w:color="000000"/>
+                <w:left w:val="none" w:sz="0" w:space="0" w:color="000000"/>
+                <w:right w:val="none" w:sz="0" w:space="0" w:color="000000"/>
+              </w:pBdr>
+              <w:spacing w:after="100" w:before="100" w:line="240"/>
+              <w:ind w:left="100" w:right="100" w:firstLine="0" w:firstLineChars="0"/>
+              <w:rPr>
+                <w:rFonts w:ascii="Calibri" w:hAnsi="Arial" w:eastAsia="Arial" w:cs="Arial"/>
+                <w:i w:val="false"/>
+                <w:b w:val="false"/>
+                <w:u w:val="none"/>
+                <w:strike w:val="false"/>
+                <w:sz w:val="20"/>
+                <w:szCs w:val="20"/>
+                <w:color w:val="000000"/>
+              </w:rPr>
+            </w:pPr>
+            <w:r>
+              <w:rPr>
+                <w:rFonts w:ascii="Calibri" w:hAnsi="Arial" w:eastAsia="Arial" w:cs="Arial"/>
+                <w:i w:val="false"/>
+                <w:b w:val="false"/>
+                <w:u w:val="none"/>
+                <w:strike w:val="false"/>
+                <w:sz w:val="20"/>
+                <w:szCs w:val="20"/>
+                <w:color w:val="000000"/>
+              </w:rPr>
+              <w:t xml:space="preserve">0.949</w:t>
+            </w:r>
+          </w:p>
+        </w:tc>
+        <w:tc>
+          <w:tcPr>
+            <w:tcBorders>
+              <w:bottom w:val="none" w:sz="0" w:space="0" w:color="000000"/>
+              <w:top w:val="none" w:sz="0" w:space="0" w:color="000000"/>
+              <w:left w:val="none" w:sz="0" w:space="0" w:color="000000"/>
+              <w:right w:val="none" w:sz="0" w:space="0" w:color="000000"/>
+            </w:tcBorders>
+            <w:shd w:val="clear" w:color="auto" w:fill="FFFFFF"/>
+            <w:tcMar>
+              <w:top w:w="0" w:type="dxa"/>
+              <w:bottom w:w="0" w:type="dxa"/>
+              <w:left w:w="0" w:type="dxa"/>
+              <w:right w:w="0" w:type="dxa"/>
+            </w:tcMar>
+            <w:vAlign w:val="center"/>
+          </w:tcPr>
+          <w:p>
+            <w:pPr>
+              <w:pStyle w:val="Normal"/>
+              <w:jc w:val="right"/>
+              <w:pBdr>
+                <w:bottom w:val="none" w:sz="0" w:space="0" w:color="000000"/>
+                <w:top w:val="none" w:sz="0" w:space="0" w:color="000000"/>
+                <w:left w:val="none" w:sz="0" w:space="0" w:color="000000"/>
+                <w:right w:val="none" w:sz="0" w:space="0" w:color="000000"/>
+              </w:pBdr>
+              <w:spacing w:after="100" w:before="100" w:line="240"/>
+              <w:ind w:left="100" w:right="100" w:firstLine="0" w:firstLineChars="0"/>
+              <w:rPr>
+                <w:rFonts w:ascii="Calibri" w:hAnsi="Arial" w:eastAsia="Arial" w:cs="Arial"/>
+                <w:i w:val="false"/>
+                <w:b w:val="false"/>
+                <w:u w:val="none"/>
+                <w:strike w:val="false"/>
+                <w:sz w:val="20"/>
+                <w:szCs w:val="20"/>
+                <w:color w:val="000000"/>
+              </w:rPr>
+            </w:pPr>
+            <w:r>
+              <w:rPr>
+                <w:rFonts w:ascii="Calibri" w:hAnsi="Arial" w:eastAsia="Arial" w:cs="Arial"/>
+                <w:i w:val="false"/>
+                <w:b w:val="false"/>
+                <w:u w:val="none"/>
+                <w:strike w:val="false"/>
+                <w:sz w:val="20"/>
+                <w:szCs w:val="20"/>
+                <w:color w:val="000000"/>
+              </w:rPr>
+              <w:t xml:space="preserve">0.929</w:t>
+            </w:r>
+          </w:p>
+        </w:tc>
+        <w:tc>
+          <w:tcPr>
+            <w:tcBorders>
+              <w:bottom w:val="none" w:sz="0" w:space="0" w:color="000000"/>
+              <w:top w:val="none" w:sz="0" w:space="0" w:color="000000"/>
+              <w:left w:val="none" w:sz="0" w:space="0" w:color="000000"/>
+              <w:right w:val="none" w:sz="0" w:space="0" w:color="000000"/>
+            </w:tcBorders>
+            <w:shd w:val="clear" w:color="auto" w:fill="FFFFFF"/>
+            <w:tcMar>
+              <w:top w:w="0" w:type="dxa"/>
+              <w:bottom w:w="0" w:type="dxa"/>
+              <w:left w:w="0" w:type="dxa"/>
+              <w:right w:w="0" w:type="dxa"/>
+            </w:tcMar>
+            <w:vAlign w:val="center"/>
+          </w:tcPr>
+          <w:p>
+            <w:pPr>
+              <w:pStyle w:val="Normal"/>
+              <w:jc w:val="right"/>
+              <w:pBdr>
+                <w:bottom w:val="none" w:sz="0" w:space="0" w:color="000000"/>
+                <w:top w:val="none" w:sz="0" w:space="0" w:color="000000"/>
+                <w:left w:val="none" w:sz="0" w:space="0" w:color="000000"/>
+                <w:right w:val="none" w:sz="0" w:space="0" w:color="000000"/>
+              </w:pBdr>
+              <w:spacing w:after="100" w:before="100" w:line="240"/>
+              <w:ind w:left="100" w:right="100" w:firstLine="0" w:firstLineChars="0"/>
+              <w:rPr>
+                <w:rFonts w:ascii="Calibri" w:hAnsi="Arial" w:eastAsia="Arial" w:cs="Arial"/>
+                <w:i w:val="false"/>
+                <w:b w:val="false"/>
+                <w:u w:val="none"/>
+                <w:strike w:val="false"/>
+                <w:sz w:val="20"/>
+                <w:szCs w:val="20"/>
+                <w:color w:val="000000"/>
+              </w:rPr>
+            </w:pPr>
+            <w:r>
+              <w:rPr>
+                <w:rFonts w:ascii="Calibri" w:hAnsi="Arial" w:eastAsia="Arial" w:cs="Arial"/>
+                <w:i w:val="false"/>
+                <w:b w:val="false"/>
+                <w:u w:val="none"/>
+                <w:strike w:val="false"/>
+                <w:sz w:val="20"/>
+                <w:szCs w:val="20"/>
+                <w:color w:val="000000"/>
+              </w:rPr>
+              <w:t xml:space="preserve">0.510</w:t>
+            </w:r>
+          </w:p>
+        </w:tc>
+        <w:tc>
+          <w:tcPr>
+            <w:tcBorders>
+              <w:bottom w:val="none" w:sz="0" w:space="0" w:color="000000"/>
+              <w:top w:val="none" w:sz="0" w:space="0" w:color="000000"/>
+              <w:left w:val="none" w:sz="0" w:space="0" w:color="000000"/>
+              <w:right w:val="none" w:sz="0" w:space="0" w:color="000000"/>
+            </w:tcBorders>
+            <w:shd w:val="clear" w:color="auto" w:fill="FFFFFF"/>
+            <w:tcMar>
+              <w:top w:w="0" w:type="dxa"/>
+              <w:bottom w:w="0" w:type="dxa"/>
+              <w:left w:w="0" w:type="dxa"/>
+              <w:right w:w="0" w:type="dxa"/>
+            </w:tcMar>
+            <w:vAlign w:val="center"/>
+          </w:tcPr>
+          <w:p>
+            <w:pPr>
+              <w:pStyle w:val="Normal"/>
+              <w:jc w:val="right"/>
+              <w:pBdr>
+                <w:bottom w:val="none" w:sz="0" w:space="0" w:color="000000"/>
+                <w:top w:val="none" w:sz="0" w:space="0" w:color="000000"/>
+                <w:left w:val="none" w:sz="0" w:space="0" w:color="000000"/>
+                <w:right w:val="none" w:sz="0" w:space="0" w:color="000000"/>
+              </w:pBdr>
+              <w:spacing w:after="100" w:before="100" w:line="240"/>
+              <w:ind w:left="100" w:right="100" w:firstLine="0" w:firstLineChars="0"/>
+              <w:rPr>
+                <w:rFonts w:ascii="Calibri" w:hAnsi="Arial" w:eastAsia="Arial" w:cs="Arial"/>
+                <w:i w:val="false"/>
+                <w:b w:val="false"/>
+                <w:u w:val="none"/>
+                <w:strike w:val="false"/>
+                <w:sz w:val="20"/>
+                <w:szCs w:val="20"/>
+                <w:color w:val="000000"/>
+              </w:rPr>
+            </w:pPr>
+            <w:r>
+              <w:rPr>
+                <w:rFonts w:ascii="Calibri" w:hAnsi="Arial" w:eastAsia="Arial" w:cs="Arial"/>
+                <w:i w:val="false"/>
+                <w:b w:val="false"/>
+                <w:u w:val="none"/>
+                <w:strike w:val="false"/>
+                <w:sz w:val="20"/>
+                <w:szCs w:val="20"/>
+                <w:color w:val="000000"/>
+              </w:rPr>
+              <w:t xml:space="preserve">0.012</w:t>
+            </w:r>
+          </w:p>
+        </w:tc>
+      </w:tr>
+      <w:tr>
+        <w:trPr>
+          <w:trHeight w:val="541" w:hRule="auto"/>
+        </w:trPr>
+        <w:tc>
+          <w:tcPr>
+            <w:tcBorders>
+              <w:bottom w:val="none" w:sz="0" w:space="0" w:color="000000"/>
+              <w:top w:val="none" w:sz="0" w:space="0" w:color="000000"/>
+              <w:left w:val="none" w:sz="0" w:space="0" w:color="000000"/>
+              <w:right w:val="none" w:sz="0" w:space="0" w:color="000000"/>
+            </w:tcBorders>
+            <w:shd w:val="clear" w:color="auto" w:fill="FFFFFF"/>
+            <w:tcMar>
+              <w:top w:w="0" w:type="dxa"/>
+              <w:bottom w:w="0" w:type="dxa"/>
+              <w:left w:w="0" w:type="dxa"/>
+              <w:right w:w="0" w:type="dxa"/>
+            </w:tcMar>
+            <w:vAlign w:val="center"/>
+          </w:tcPr>
+          <w:p>
+            <w:pPr>
+              <w:pStyle w:val="Normal"/>
+              <w:jc w:val="left"/>
+              <w:pBdr>
+                <w:bottom w:val="none" w:sz="0" w:space="0" w:color="000000"/>
+                <w:top w:val="none" w:sz="0" w:space="0" w:color="000000"/>
+                <w:left w:val="none" w:sz="0" w:space="0" w:color="000000"/>
+                <w:right w:val="none" w:sz="0" w:space="0" w:color="000000"/>
+              </w:pBdr>
+              <w:spacing w:after="100" w:before="100" w:line="240"/>
+              <w:ind w:left="100" w:right="100" w:firstLine="0" w:firstLineChars="0"/>
+              <w:rPr>
+                <w:rFonts w:ascii="Calibri" w:hAnsi="Arial" w:eastAsia="Arial" w:cs="Arial"/>
+                <w:i w:val="false"/>
+                <w:b w:val="false"/>
+                <w:u w:val="none"/>
+                <w:strike w:val="false"/>
+                <w:sz w:val="20"/>
+                <w:szCs w:val="20"/>
+                <w:color w:val="000000"/>
+              </w:rPr>
+            </w:pPr>
+            <w:r>
+              <w:rPr>
+                <w:rFonts w:ascii="Calibri" w:hAnsi="Arial" w:eastAsia="Arial" w:cs="Arial"/>
+                <w:i w:val="false"/>
+                <w:b w:val="false"/>
+                <w:u w:val="none"/>
+                <w:strike w:val="false"/>
+                <w:sz w:val="20"/>
+                <w:szCs w:val="20"/>
+                <w:color w:val="000000"/>
+              </w:rPr>
               <w:t xml:space="preserve">LASSO</w:t>
             </w:r>
           </w:p>
@@ -429,7 +1829,7 @@
           <w:tcPr>
             <w:tcBorders>
               <w:bottom w:val="none" w:sz="0" w:space="0" w:color="000000"/>
-              <w:top w:val="single" w:sz="12" w:space="0" w:color="666666"/>
+              <w:top w:val="none" w:sz="0" w:space="0" w:color="000000"/>
               <w:left w:val="none" w:sz="0" w:space="0" w:color="000000"/>
               <w:right w:val="none" w:sz="0" w:space="0" w:color="000000"/>
             </w:tcBorders>
@@ -476,7 +1876,7 @@
                 <w:szCs w:val="20"/>
                 <w:color w:val="000000"/>
               </w:rPr>
-              <w:t xml:space="preserve">0.268</w:t>
+              <w:t xml:space="preserve">0.264</w:t>
             </w:r>
           </w:p>
         </w:tc>
@@ -484,7 +1884,7 @@
           <w:tcPr>
             <w:tcBorders>
               <w:bottom w:val="none" w:sz="0" w:space="0" w:color="000000"/>
-              <w:top w:val="single" w:sz="12" w:space="0" w:color="666666"/>
+              <w:top w:val="none" w:sz="0" w:space="0" w:color="000000"/>
               <w:left w:val="none" w:sz="0" w:space="0" w:color="000000"/>
               <w:right w:val="none" w:sz="0" w:space="0" w:color="000000"/>
             </w:tcBorders>
@@ -531,7 +1931,7 @@
                 <w:szCs w:val="20"/>
                 <w:color w:val="000000"/>
               </w:rPr>
-              <w:t xml:space="preserve">0.000</w:t>
+              <w:t xml:space="preserve">0.368</w:t>
             </w:r>
           </w:p>
         </w:tc>
@@ -539,7 +1939,7 @@
           <w:tcPr>
             <w:tcBorders>
               <w:bottom w:val="none" w:sz="0" w:space="0" w:color="000000"/>
-              <w:top w:val="single" w:sz="12" w:space="0" w:color="666666"/>
+              <w:top w:val="none" w:sz="0" w:space="0" w:color="000000"/>
               <w:left w:val="none" w:sz="0" w:space="0" w:color="000000"/>
               <w:right w:val="none" w:sz="0" w:space="0" w:color="000000"/>
             </w:tcBorders>
@@ -586,7 +1986,7 @@
                 <w:szCs w:val="20"/>
                 <w:color w:val="000000"/>
               </w:rPr>
-              <w:t xml:space="preserve">0.014</w:t>
+              <w:t xml:space="preserve">0.571</w:t>
             </w:r>
           </w:p>
         </w:tc>
@@ -594,7 +1994,7 @@
           <w:tcPr>
             <w:tcBorders>
               <w:bottom w:val="none" w:sz="0" w:space="0" w:color="000000"/>
-              <w:top w:val="single" w:sz="12" w:space="0" w:color="666666"/>
+              <w:top w:val="none" w:sz="0" w:space="0" w:color="000000"/>
               <w:left w:val="none" w:sz="0" w:space="0" w:color="000000"/>
               <w:right w:val="none" w:sz="0" w:space="0" w:color="000000"/>
             </w:tcBorders>
@@ -641,7 +2041,7 @@
                 <w:szCs w:val="20"/>
                 <w:color w:val="000000"/>
               </w:rPr>
-              <w:t xml:space="preserve">0.000</w:t>
+              <w:t xml:space="preserve">0.129</w:t>
             </w:r>
           </w:p>
         </w:tc>
@@ -756,7 +2156,7 @@
                 <w:szCs w:val="20"/>
                 <w:color w:val="000000"/>
               </w:rPr>
-              <w:t xml:space="preserve">0.232</w:t>
+              <w:t xml:space="preserve">0.229</w:t>
             </w:r>
           </w:p>
         </w:tc>
@@ -811,7 +2211,7 @@
                 <w:szCs w:val="20"/>
                 <w:color w:val="000000"/>
               </w:rPr>
-              <w:t xml:space="preserve">0.012</w:t>
+              <w:t xml:space="preserve">0.521</w:t>
             </w:r>
           </w:p>
         </w:tc>
@@ -866,7 +2266,7 @@
                 <w:szCs w:val="20"/>
                 <w:color w:val="000000"/>
               </w:rPr>
-              <w:t xml:space="preserve">0.028</w:t>
+              <w:t xml:space="preserve">0.665</w:t>
             </w:r>
           </w:p>
         </w:tc>
@@ -921,287 +2321,7 @@
                 <w:szCs w:val="20"/>
                 <w:color w:val="000000"/>
               </w:rPr>
-              <w:t xml:space="preserve">0.000</w:t>
-            </w:r>
-          </w:p>
-        </w:tc>
-      </w:tr>
-      <w:tr>
-        <w:trPr>
-          <w:trHeight w:val="548" w:hRule="auto"/>
-        </w:trPr>
-        <w:tc>
-          <w:tcPr>
-            <w:tcBorders>
-              <w:bottom w:val="none" w:sz="0" w:space="0" w:color="000000"/>
-              <w:top w:val="none" w:sz="0" w:space="0" w:color="000000"/>
-              <w:left w:val="none" w:sz="0" w:space="0" w:color="000000"/>
-              <w:right w:val="none" w:sz="0" w:space="0" w:color="000000"/>
-            </w:tcBorders>
-            <w:shd w:val="clear" w:color="auto" w:fill="FFFFFF"/>
-            <w:tcMar>
-              <w:top w:w="0" w:type="dxa"/>
-              <w:bottom w:w="0" w:type="dxa"/>
-              <w:left w:w="0" w:type="dxa"/>
-              <w:right w:w="0" w:type="dxa"/>
-            </w:tcMar>
-            <w:vAlign w:val="center"/>
-          </w:tcPr>
-          <w:p>
-            <w:pPr>
-              <w:pStyle w:val="Normal"/>
-              <w:jc w:val="left"/>
-              <w:pBdr>
-                <w:bottom w:val="none" w:sz="0" w:space="0" w:color="000000"/>
-                <w:top w:val="none" w:sz="0" w:space="0" w:color="000000"/>
-                <w:left w:val="none" w:sz="0" w:space="0" w:color="000000"/>
-                <w:right w:val="none" w:sz="0" w:space="0" w:color="000000"/>
-              </w:pBdr>
-              <w:spacing w:after="100" w:before="100" w:line="240"/>
-              <w:ind w:left="100" w:right="100" w:firstLine="0" w:firstLineChars="0"/>
-              <w:rPr>
-                <w:rFonts w:ascii="Calibri" w:hAnsi="Arial" w:eastAsia="Arial" w:cs="Arial"/>
-                <w:i w:val="false"/>
-                <w:b w:val="false"/>
-                <w:u w:val="none"/>
-                <w:strike w:val="false"/>
-                <w:sz w:val="20"/>
-                <w:szCs w:val="20"/>
-                <w:color w:val="000000"/>
-              </w:rPr>
-            </w:pPr>
-            <w:r>
-              <w:rPr>
-                <w:rFonts w:ascii="Calibri" w:hAnsi="Arial" w:eastAsia="Arial" w:cs="Arial"/>
-                <w:i w:val="false"/>
-                <w:b w:val="false"/>
-                <w:u w:val="none"/>
-                <w:strike w:val="false"/>
-                <w:sz w:val="20"/>
-                <w:szCs w:val="20"/>
-                <w:color w:val="000000"/>
-              </w:rPr>
-              <w:t xml:space="preserve">Random Forest</w:t>
-            </w:r>
-          </w:p>
-        </w:tc>
-        <w:tc>
-          <w:tcPr>
-            <w:tcBorders>
-              <w:bottom w:val="none" w:sz="0" w:space="0" w:color="000000"/>
-              <w:top w:val="none" w:sz="0" w:space="0" w:color="000000"/>
-              <w:left w:val="none" w:sz="0" w:space="0" w:color="000000"/>
-              <w:right w:val="none" w:sz="0" w:space="0" w:color="000000"/>
-            </w:tcBorders>
-            <w:shd w:val="clear" w:color="auto" w:fill="FFFFFF"/>
-            <w:tcMar>
-              <w:top w:w="0" w:type="dxa"/>
-              <w:bottom w:w="0" w:type="dxa"/>
-              <w:left w:w="0" w:type="dxa"/>
-              <w:right w:w="0" w:type="dxa"/>
-            </w:tcMar>
-            <w:vAlign w:val="center"/>
-          </w:tcPr>
-          <w:p>
-            <w:pPr>
-              <w:pStyle w:val="Normal"/>
-              <w:jc w:val="right"/>
-              <w:pBdr>
-                <w:bottom w:val="none" w:sz="0" w:space="0" w:color="000000"/>
-                <w:top w:val="none" w:sz="0" w:space="0" w:color="000000"/>
-                <w:left w:val="none" w:sz="0" w:space="0" w:color="000000"/>
-                <w:right w:val="none" w:sz="0" w:space="0" w:color="000000"/>
-              </w:pBdr>
-              <w:spacing w:after="100" w:before="100" w:line="240"/>
-              <w:ind w:left="100" w:right="100" w:firstLine="0" w:firstLineChars="0"/>
-              <w:rPr>
-                <w:rFonts w:ascii="Calibri" w:hAnsi="Arial" w:eastAsia="Arial" w:cs="Arial"/>
-                <w:i w:val="false"/>
-                <w:b w:val="false"/>
-                <w:u w:val="none"/>
-                <w:strike w:val="false"/>
-                <w:sz w:val="20"/>
-                <w:szCs w:val="20"/>
-                <w:color w:val="000000"/>
-              </w:rPr>
-            </w:pPr>
-            <w:r>
-              <w:rPr>
-                <w:rFonts w:ascii="Calibri" w:hAnsi="Arial" w:eastAsia="Arial" w:cs="Arial"/>
-                <w:i w:val="false"/>
-                <w:b w:val="false"/>
-                <w:u w:val="none"/>
-                <w:strike w:val="false"/>
-                <w:sz w:val="20"/>
-                <w:szCs w:val="20"/>
-                <w:color w:val="000000"/>
-              </w:rPr>
-              <w:t xml:space="preserve">0.851</w:t>
-            </w:r>
-          </w:p>
-        </w:tc>
-        <w:tc>
-          <w:tcPr>
-            <w:tcBorders>
-              <w:bottom w:val="none" w:sz="0" w:space="0" w:color="000000"/>
-              <w:top w:val="none" w:sz="0" w:space="0" w:color="000000"/>
-              <w:left w:val="none" w:sz="0" w:space="0" w:color="000000"/>
-              <w:right w:val="none" w:sz="0" w:space="0" w:color="000000"/>
-            </w:tcBorders>
-            <w:shd w:val="clear" w:color="auto" w:fill="FFFFFF"/>
-            <w:tcMar>
-              <w:top w:w="0" w:type="dxa"/>
-              <w:bottom w:w="0" w:type="dxa"/>
-              <w:left w:w="0" w:type="dxa"/>
-              <w:right w:w="0" w:type="dxa"/>
-            </w:tcMar>
-            <w:vAlign w:val="center"/>
-          </w:tcPr>
-          <w:p>
-            <w:pPr>
-              <w:pStyle w:val="Normal"/>
-              <w:jc w:val="right"/>
-              <w:pBdr>
-                <w:bottom w:val="none" w:sz="0" w:space="0" w:color="000000"/>
-                <w:top w:val="none" w:sz="0" w:space="0" w:color="000000"/>
-                <w:left w:val="none" w:sz="0" w:space="0" w:color="000000"/>
-                <w:right w:val="none" w:sz="0" w:space="0" w:color="000000"/>
-              </w:pBdr>
-              <w:spacing w:after="100" w:before="100" w:line="240"/>
-              <w:ind w:left="100" w:right="100" w:firstLine="0" w:firstLineChars="0"/>
-              <w:rPr>
-                <w:rFonts w:ascii="Calibri" w:hAnsi="Arial" w:eastAsia="Arial" w:cs="Arial"/>
-                <w:i w:val="false"/>
-                <w:b w:val="false"/>
-                <w:u w:val="none"/>
-                <w:strike w:val="false"/>
-                <w:sz w:val="20"/>
-                <w:szCs w:val="20"/>
-                <w:color w:val="000000"/>
-              </w:rPr>
-            </w:pPr>
-            <w:r>
-              <w:rPr>
-                <w:rFonts w:ascii="Calibri" w:hAnsi="Arial" w:eastAsia="Arial" w:cs="Arial"/>
-                <w:i w:val="false"/>
-                <w:b w:val="false"/>
-                <w:u w:val="none"/>
-                <w:strike w:val="false"/>
-                <w:sz w:val="20"/>
-                <w:szCs w:val="20"/>
-                <w:color w:val="000000"/>
-              </w:rPr>
-              <w:t xml:space="preserve">0.825</w:t>
-            </w:r>
-          </w:p>
-        </w:tc>
-        <w:tc>
-          <w:tcPr>
-            <w:tcBorders>
-              <w:bottom w:val="none" w:sz="0" w:space="0" w:color="000000"/>
-              <w:top w:val="none" w:sz="0" w:space="0" w:color="000000"/>
-              <w:left w:val="none" w:sz="0" w:space="0" w:color="000000"/>
-              <w:right w:val="none" w:sz="0" w:space="0" w:color="000000"/>
-            </w:tcBorders>
-            <w:shd w:val="clear" w:color="auto" w:fill="FFFFFF"/>
-            <w:tcMar>
-              <w:top w:w="0" w:type="dxa"/>
-              <w:bottom w:w="0" w:type="dxa"/>
-              <w:left w:w="0" w:type="dxa"/>
-              <w:right w:w="0" w:type="dxa"/>
-            </w:tcMar>
-            <w:vAlign w:val="center"/>
-          </w:tcPr>
-          <w:p>
-            <w:pPr>
-              <w:pStyle w:val="Normal"/>
-              <w:jc w:val="right"/>
-              <w:pBdr>
-                <w:bottom w:val="none" w:sz="0" w:space="0" w:color="000000"/>
-                <w:top w:val="none" w:sz="0" w:space="0" w:color="000000"/>
-                <w:left w:val="none" w:sz="0" w:space="0" w:color="000000"/>
-                <w:right w:val="none" w:sz="0" w:space="0" w:color="000000"/>
-              </w:pBdr>
-              <w:spacing w:after="100" w:before="100" w:line="240"/>
-              <w:ind w:left="100" w:right="100" w:firstLine="0" w:firstLineChars="0"/>
-              <w:rPr>
-                <w:rFonts w:ascii="Calibri" w:hAnsi="Arial" w:eastAsia="Arial" w:cs="Arial"/>
-                <w:i w:val="false"/>
-                <w:b w:val="false"/>
-                <w:u w:val="none"/>
-                <w:strike w:val="false"/>
-                <w:sz w:val="20"/>
-                <w:szCs w:val="20"/>
-                <w:color w:val="000000"/>
-              </w:rPr>
-            </w:pPr>
-            <w:r>
-              <w:rPr>
-                <w:rFonts w:ascii="Calibri" w:hAnsi="Arial" w:eastAsia="Arial" w:cs="Arial"/>
-                <w:i w:val="false"/>
-                <w:b w:val="false"/>
-                <w:u w:val="none"/>
-                <w:strike w:val="false"/>
-                <w:sz w:val="20"/>
-                <w:szCs w:val="20"/>
-                <w:color w:val="000000"/>
-              </w:rPr>
-              <w:t xml:space="preserve">0.013</w:t>
-            </w:r>
-          </w:p>
-        </w:tc>
-        <w:tc>
-          <w:tcPr>
-            <w:tcBorders>
-              <w:bottom w:val="none" w:sz="0" w:space="0" w:color="000000"/>
-              <w:top w:val="none" w:sz="0" w:space="0" w:color="000000"/>
-              <w:left w:val="none" w:sz="0" w:space="0" w:color="000000"/>
-              <w:right w:val="none" w:sz="0" w:space="0" w:color="000000"/>
-            </w:tcBorders>
-            <w:shd w:val="clear" w:color="auto" w:fill="FFFFFF"/>
-            <w:tcMar>
-              <w:top w:w="0" w:type="dxa"/>
-              <w:bottom w:w="0" w:type="dxa"/>
-              <w:left w:w="0" w:type="dxa"/>
-              <w:right w:w="0" w:type="dxa"/>
-            </w:tcMar>
-            <w:vAlign w:val="center"/>
-          </w:tcPr>
-          <w:p>
-            <w:pPr>
-              <w:pStyle w:val="Normal"/>
-              <w:jc w:val="right"/>
-              <w:pBdr>
-                <w:bottom w:val="none" w:sz="0" w:space="0" w:color="000000"/>
-                <w:top w:val="none" w:sz="0" w:space="0" w:color="000000"/>
-                <w:left w:val="none" w:sz="0" w:space="0" w:color="000000"/>
-                <w:right w:val="none" w:sz="0" w:space="0" w:color="000000"/>
-              </w:pBdr>
-              <w:spacing w:after="100" w:before="100" w:line="240"/>
-              <w:ind w:left="100" w:right="100" w:firstLine="0" w:firstLineChars="0"/>
-              <w:rPr>
-                <w:rFonts w:ascii="Calibri" w:hAnsi="Arial" w:eastAsia="Arial" w:cs="Arial"/>
-                <w:i w:val="false"/>
-                <w:b w:val="false"/>
-                <w:u w:val="none"/>
-                <w:strike w:val="false"/>
-                <w:sz w:val="20"/>
-                <w:szCs w:val="20"/>
-                <w:color w:val="000000"/>
-              </w:rPr>
-            </w:pPr>
-            <w:r>
-              <w:rPr>
-                <w:rFonts w:ascii="Calibri" w:hAnsi="Arial" w:eastAsia="Arial" w:cs="Arial"/>
-                <w:i w:val="false"/>
-                <w:b w:val="false"/>
-                <w:u w:val="none"/>
-                <w:strike w:val="false"/>
-                <w:sz w:val="20"/>
-                <w:szCs w:val="20"/>
-                <w:color w:val="000000"/>
-              </w:rPr>
-              <w:t xml:space="preserve">0.000</w:t>
+              <w:t xml:space="preserve">0.200</w:t>
             </w:r>
           </w:p>
         </w:tc>
@@ -1213,566 +2333,6 @@
         <w:tc>
           <w:tcPr>
             <w:tcBorders>
-              <w:bottom w:val="none" w:sz="0" w:space="0" w:color="000000"/>
-              <w:top w:val="none" w:sz="0" w:space="0" w:color="000000"/>
-              <w:left w:val="none" w:sz="0" w:space="0" w:color="000000"/>
-              <w:right w:val="none" w:sz="0" w:space="0" w:color="000000"/>
-            </w:tcBorders>
-            <w:shd w:val="clear" w:color="auto" w:fill="FFFFFF"/>
-            <w:tcMar>
-              <w:top w:w="0" w:type="dxa"/>
-              <w:bottom w:w="0" w:type="dxa"/>
-              <w:left w:w="0" w:type="dxa"/>
-              <w:right w:w="0" w:type="dxa"/>
-            </w:tcMar>
-            <w:vAlign w:val="center"/>
-          </w:tcPr>
-          <w:p>
-            <w:pPr>
-              <w:pStyle w:val="Normal"/>
-              <w:jc w:val="left"/>
-              <w:pBdr>
-                <w:bottom w:val="none" w:sz="0" w:space="0" w:color="000000"/>
-                <w:top w:val="none" w:sz="0" w:space="0" w:color="000000"/>
-                <w:left w:val="none" w:sz="0" w:space="0" w:color="000000"/>
-                <w:right w:val="none" w:sz="0" w:space="0" w:color="000000"/>
-              </w:pBdr>
-              <w:spacing w:after="100" w:before="100" w:line="240"/>
-              <w:ind w:left="100" w:right="100" w:firstLine="0" w:firstLineChars="0"/>
-              <w:rPr>
-                <w:rFonts w:ascii="Calibri" w:hAnsi="Arial" w:eastAsia="Arial" w:cs="Arial"/>
-                <w:i w:val="false"/>
-                <w:b w:val="false"/>
-                <w:u w:val="none"/>
-                <w:strike w:val="false"/>
-                <w:sz w:val="20"/>
-                <w:szCs w:val="20"/>
-                <w:color w:val="000000"/>
-              </w:rPr>
-            </w:pPr>
-            <w:r>
-              <w:rPr>
-                <w:rFonts w:ascii="Calibri" w:hAnsi="Arial" w:eastAsia="Arial" w:cs="Arial"/>
-                <w:i w:val="false"/>
-                <w:b w:val="false"/>
-                <w:u w:val="none"/>
-                <w:strike w:val="false"/>
-                <w:sz w:val="20"/>
-                <w:szCs w:val="20"/>
-                <w:color w:val="000000"/>
-              </w:rPr>
-              <w:t xml:space="preserve">AR</w:t>
-            </w:r>
-          </w:p>
-        </w:tc>
-        <w:tc>
-          <w:tcPr>
-            <w:tcBorders>
-              <w:bottom w:val="none" w:sz="0" w:space="0" w:color="000000"/>
-              <w:top w:val="none" w:sz="0" w:space="0" w:color="000000"/>
-              <w:left w:val="none" w:sz="0" w:space="0" w:color="000000"/>
-              <w:right w:val="none" w:sz="0" w:space="0" w:color="000000"/>
-            </w:tcBorders>
-            <w:shd w:val="clear" w:color="auto" w:fill="FFFFFF"/>
-            <w:tcMar>
-              <w:top w:w="0" w:type="dxa"/>
-              <w:bottom w:w="0" w:type="dxa"/>
-              <w:left w:w="0" w:type="dxa"/>
-              <w:right w:w="0" w:type="dxa"/>
-            </w:tcMar>
-            <w:vAlign w:val="center"/>
-          </w:tcPr>
-          <w:p>
-            <w:pPr>
-              <w:pStyle w:val="Normal"/>
-              <w:jc w:val="right"/>
-              <w:pBdr>
-                <w:bottom w:val="none" w:sz="0" w:space="0" w:color="000000"/>
-                <w:top w:val="none" w:sz="0" w:space="0" w:color="000000"/>
-                <w:left w:val="none" w:sz="0" w:space="0" w:color="000000"/>
-                <w:right w:val="none" w:sz="0" w:space="0" w:color="000000"/>
-              </w:pBdr>
-              <w:spacing w:after="100" w:before="100" w:line="240"/>
-              <w:ind w:left="100" w:right="100" w:firstLine="0" w:firstLineChars="0"/>
-              <w:rPr>
-                <w:rFonts w:ascii="Calibri" w:hAnsi="Arial" w:eastAsia="Arial" w:cs="Arial"/>
-                <w:i w:val="false"/>
-                <w:b w:val="false"/>
-                <w:u w:val="none"/>
-                <w:strike w:val="false"/>
-                <w:sz w:val="20"/>
-                <w:szCs w:val="20"/>
-                <w:color w:val="000000"/>
-              </w:rPr>
-            </w:pPr>
-            <w:r>
-              <w:rPr>
-                <w:rFonts w:ascii="Calibri" w:hAnsi="Arial" w:eastAsia="Arial" w:cs="Arial"/>
-                <w:i w:val="false"/>
-                <w:b w:val="false"/>
-                <w:u w:val="none"/>
-                <w:strike w:val="false"/>
-                <w:sz w:val="20"/>
-                <w:szCs w:val="20"/>
-                <w:color w:val="000000"/>
-              </w:rPr>
-              <w:t xml:space="preserve">0.150</w:t>
-            </w:r>
-          </w:p>
-        </w:tc>
-        <w:tc>
-          <w:tcPr>
-            <w:tcBorders>
-              <w:bottom w:val="none" w:sz="0" w:space="0" w:color="000000"/>
-              <w:top w:val="none" w:sz="0" w:space="0" w:color="000000"/>
-              <w:left w:val="none" w:sz="0" w:space="0" w:color="000000"/>
-              <w:right w:val="none" w:sz="0" w:space="0" w:color="000000"/>
-            </w:tcBorders>
-            <w:shd w:val="clear" w:color="auto" w:fill="FFFFFF"/>
-            <w:tcMar>
-              <w:top w:w="0" w:type="dxa"/>
-              <w:bottom w:w="0" w:type="dxa"/>
-              <w:left w:w="0" w:type="dxa"/>
-              <w:right w:w="0" w:type="dxa"/>
-            </w:tcMar>
-            <w:vAlign w:val="center"/>
-          </w:tcPr>
-          <w:p>
-            <w:pPr>
-              <w:pStyle w:val="Normal"/>
-              <w:jc w:val="right"/>
-              <w:pBdr>
-                <w:bottom w:val="none" w:sz="0" w:space="0" w:color="000000"/>
-                <w:top w:val="none" w:sz="0" w:space="0" w:color="000000"/>
-                <w:left w:val="none" w:sz="0" w:space="0" w:color="000000"/>
-                <w:right w:val="none" w:sz="0" w:space="0" w:color="000000"/>
-              </w:pBdr>
-              <w:spacing w:after="100" w:before="100" w:line="240"/>
-              <w:ind w:left="100" w:right="100" w:firstLine="0" w:firstLineChars="0"/>
-              <w:rPr>
-                <w:rFonts w:ascii="Calibri" w:hAnsi="Arial" w:eastAsia="Arial" w:cs="Arial"/>
-                <w:i w:val="false"/>
-                <w:b w:val="false"/>
-                <w:u w:val="none"/>
-                <w:strike w:val="false"/>
-                <w:sz w:val="20"/>
-                <w:szCs w:val="20"/>
-                <w:color w:val="000000"/>
-              </w:rPr>
-            </w:pPr>
-            <w:r>
-              <w:rPr>
-                <w:rFonts w:ascii="Calibri" w:hAnsi="Arial" w:eastAsia="Arial" w:cs="Arial"/>
-                <w:i w:val="false"/>
-                <w:b w:val="false"/>
-                <w:u w:val="none"/>
-                <w:strike w:val="false"/>
-                <w:sz w:val="20"/>
-                <w:szCs w:val="20"/>
-                <w:color w:val="000000"/>
-              </w:rPr>
-              <w:t xml:space="preserve">0.010</w:t>
-            </w:r>
-          </w:p>
-        </w:tc>
-        <w:tc>
-          <w:tcPr>
-            <w:tcBorders>
-              <w:bottom w:val="none" w:sz="0" w:space="0" w:color="000000"/>
-              <w:top w:val="none" w:sz="0" w:space="0" w:color="000000"/>
-              <w:left w:val="none" w:sz="0" w:space="0" w:color="000000"/>
-              <w:right w:val="none" w:sz="0" w:space="0" w:color="000000"/>
-            </w:tcBorders>
-            <w:shd w:val="clear" w:color="auto" w:fill="FFFFFF"/>
-            <w:tcMar>
-              <w:top w:w="0" w:type="dxa"/>
-              <w:bottom w:w="0" w:type="dxa"/>
-              <w:left w:w="0" w:type="dxa"/>
-              <w:right w:w="0" w:type="dxa"/>
-            </w:tcMar>
-            <w:vAlign w:val="center"/>
-          </w:tcPr>
-          <w:p>
-            <w:pPr>
-              <w:pStyle w:val="Normal"/>
-              <w:jc w:val="right"/>
-              <w:pBdr>
-                <w:bottom w:val="none" w:sz="0" w:space="0" w:color="000000"/>
-                <w:top w:val="none" w:sz="0" w:space="0" w:color="000000"/>
-                <w:left w:val="none" w:sz="0" w:space="0" w:color="000000"/>
-                <w:right w:val="none" w:sz="0" w:space="0" w:color="000000"/>
-              </w:pBdr>
-              <w:spacing w:after="100" w:before="100" w:line="240"/>
-              <w:ind w:left="100" w:right="100" w:firstLine="0" w:firstLineChars="0"/>
-              <w:rPr>
-                <w:rFonts w:ascii="Calibri" w:hAnsi="Arial" w:eastAsia="Arial" w:cs="Arial"/>
-                <w:i w:val="false"/>
-                <w:b w:val="false"/>
-                <w:u w:val="none"/>
-                <w:strike w:val="false"/>
-                <w:sz w:val="20"/>
-                <w:szCs w:val="20"/>
-                <w:color w:val="000000"/>
-              </w:rPr>
-            </w:pPr>
-            <w:r>
-              <w:rPr>
-                <w:rFonts w:ascii="Calibri" w:hAnsi="Arial" w:eastAsia="Arial" w:cs="Arial"/>
-                <w:i w:val="false"/>
-                <w:b w:val="false"/>
-                <w:u w:val="none"/>
-                <w:strike w:val="false"/>
-                <w:sz w:val="20"/>
-                <w:szCs w:val="20"/>
-                <w:color w:val="000000"/>
-              </w:rPr>
-              <w:t xml:space="preserve">0.001</w:t>
-            </w:r>
-          </w:p>
-        </w:tc>
-        <w:tc>
-          <w:tcPr>
-            <w:tcBorders>
-              <w:bottom w:val="none" w:sz="0" w:space="0" w:color="000000"/>
-              <w:top w:val="none" w:sz="0" w:space="0" w:color="000000"/>
-              <w:left w:val="none" w:sz="0" w:space="0" w:color="000000"/>
-              <w:right w:val="none" w:sz="0" w:space="0" w:color="000000"/>
-            </w:tcBorders>
-            <w:shd w:val="clear" w:color="auto" w:fill="FFFFFF"/>
-            <w:tcMar>
-              <w:top w:w="0" w:type="dxa"/>
-              <w:bottom w:w="0" w:type="dxa"/>
-              <w:left w:w="0" w:type="dxa"/>
-              <w:right w:w="0" w:type="dxa"/>
-            </w:tcMar>
-            <w:vAlign w:val="center"/>
-          </w:tcPr>
-          <w:p>
-            <w:pPr>
-              <w:pStyle w:val="Normal"/>
-              <w:jc w:val="right"/>
-              <w:pBdr>
-                <w:bottom w:val="none" w:sz="0" w:space="0" w:color="000000"/>
-                <w:top w:val="none" w:sz="0" w:space="0" w:color="000000"/>
-                <w:left w:val="none" w:sz="0" w:space="0" w:color="000000"/>
-                <w:right w:val="none" w:sz="0" w:space="0" w:color="000000"/>
-              </w:pBdr>
-              <w:spacing w:after="100" w:before="100" w:line="240"/>
-              <w:ind w:left="100" w:right="100" w:firstLine="0" w:firstLineChars="0"/>
-              <w:rPr>
-                <w:rFonts w:ascii="Calibri" w:hAnsi="Arial" w:eastAsia="Arial" w:cs="Arial"/>
-                <w:i w:val="false"/>
-                <w:b w:val="false"/>
-                <w:u w:val="none"/>
-                <w:strike w:val="false"/>
-                <w:sz w:val="20"/>
-                <w:szCs w:val="20"/>
-                <w:color w:val="000000"/>
-              </w:rPr>
-            </w:pPr>
-            <w:r>
-              <w:rPr>
-                <w:rFonts w:ascii="Calibri" w:hAnsi="Arial" w:eastAsia="Arial" w:cs="Arial"/>
-                <w:i w:val="false"/>
-                <w:b w:val="false"/>
-                <w:u w:val="none"/>
-                <w:strike w:val="false"/>
-                <w:sz w:val="20"/>
-                <w:szCs w:val="20"/>
-                <w:color w:val="000000"/>
-              </w:rPr>
-              <w:t xml:space="preserve">0.000</w:t>
-            </w:r>
-          </w:p>
-        </w:tc>
-      </w:tr>
-      <w:tr>
-        <w:trPr>
-          <w:trHeight w:val="541" w:hRule="auto"/>
-        </w:trPr>
-        <w:tc>
-          <w:tcPr>
-            <w:tcBorders>
-              <w:bottom w:val="none" w:sz="0" w:space="0" w:color="000000"/>
-              <w:top w:val="none" w:sz="0" w:space="0" w:color="000000"/>
-              <w:left w:val="none" w:sz="0" w:space="0" w:color="000000"/>
-              <w:right w:val="none" w:sz="0" w:space="0" w:color="000000"/>
-            </w:tcBorders>
-            <w:shd w:val="clear" w:color="auto" w:fill="FFFFFF"/>
-            <w:tcMar>
-              <w:top w:w="0" w:type="dxa"/>
-              <w:bottom w:w="0" w:type="dxa"/>
-              <w:left w:w="0" w:type="dxa"/>
-              <w:right w:w="0" w:type="dxa"/>
-            </w:tcMar>
-            <w:vAlign w:val="center"/>
-          </w:tcPr>
-          <w:p>
-            <w:pPr>
-              <w:pStyle w:val="Normal"/>
-              <w:jc w:val="left"/>
-              <w:pBdr>
-                <w:bottom w:val="none" w:sz="0" w:space="0" w:color="000000"/>
-                <w:top w:val="none" w:sz="0" w:space="0" w:color="000000"/>
-                <w:left w:val="none" w:sz="0" w:space="0" w:color="000000"/>
-                <w:right w:val="none" w:sz="0" w:space="0" w:color="000000"/>
-              </w:pBdr>
-              <w:spacing w:after="100" w:before="100" w:line="240"/>
-              <w:ind w:left="100" w:right="100" w:firstLine="0" w:firstLineChars="0"/>
-              <w:rPr>
-                <w:rFonts w:ascii="Calibri" w:hAnsi="Arial" w:eastAsia="Arial" w:cs="Arial"/>
-                <w:i w:val="false"/>
-                <w:b w:val="false"/>
-                <w:u w:val="none"/>
-                <w:strike w:val="false"/>
-                <w:sz w:val="20"/>
-                <w:szCs w:val="20"/>
-                <w:color w:val="000000"/>
-              </w:rPr>
-            </w:pPr>
-            <w:r>
-              <w:rPr>
-                <w:rFonts w:ascii="Calibri" w:hAnsi="Arial" w:eastAsia="Arial" w:cs="Arial"/>
-                <w:i w:val="false"/>
-                <w:b w:val="false"/>
-                <w:u w:val="none"/>
-                <w:strike w:val="false"/>
-                <w:sz w:val="20"/>
-                <w:szCs w:val="20"/>
-                <w:color w:val="000000"/>
-              </w:rPr>
-              <w:t xml:space="preserve">2SRR-AR</w:t>
-            </w:r>
-          </w:p>
-        </w:tc>
-        <w:tc>
-          <w:tcPr>
-            <w:tcBorders>
-              <w:bottom w:val="none" w:sz="0" w:space="0" w:color="000000"/>
-              <w:top w:val="none" w:sz="0" w:space="0" w:color="000000"/>
-              <w:left w:val="none" w:sz="0" w:space="0" w:color="000000"/>
-              <w:right w:val="none" w:sz="0" w:space="0" w:color="000000"/>
-            </w:tcBorders>
-            <w:shd w:val="clear" w:color="auto" w:fill="FFFFFF"/>
-            <w:tcMar>
-              <w:top w:w="0" w:type="dxa"/>
-              <w:bottom w:w="0" w:type="dxa"/>
-              <w:left w:w="0" w:type="dxa"/>
-              <w:right w:w="0" w:type="dxa"/>
-            </w:tcMar>
-            <w:vAlign w:val="center"/>
-          </w:tcPr>
-          <w:p>
-            <w:pPr>
-              <w:pStyle w:val="Normal"/>
-              <w:jc w:val="right"/>
-              <w:pBdr>
-                <w:bottom w:val="none" w:sz="0" w:space="0" w:color="000000"/>
-                <w:top w:val="none" w:sz="0" w:space="0" w:color="000000"/>
-                <w:left w:val="none" w:sz="0" w:space="0" w:color="000000"/>
-                <w:right w:val="none" w:sz="0" w:space="0" w:color="000000"/>
-              </w:pBdr>
-              <w:spacing w:after="100" w:before="100" w:line="240"/>
-              <w:ind w:left="100" w:right="100" w:firstLine="0" w:firstLineChars="0"/>
-              <w:rPr>
-                <w:rFonts w:ascii="Calibri" w:hAnsi="Arial" w:eastAsia="Arial" w:cs="Arial"/>
-                <w:i w:val="false"/>
-                <w:b w:val="false"/>
-                <w:u w:val="none"/>
-                <w:strike w:val="false"/>
-                <w:sz w:val="20"/>
-                <w:szCs w:val="20"/>
-                <w:color w:val="000000"/>
-              </w:rPr>
-            </w:pPr>
-            <w:r>
-              <w:rPr>
-                <w:rFonts w:ascii="Calibri" w:hAnsi="Arial" w:eastAsia="Arial" w:cs="Arial"/>
-                <w:i w:val="false"/>
-                <w:b w:val="false"/>
-                <w:u w:val="none"/>
-                <w:strike w:val="false"/>
-                <w:sz w:val="20"/>
-                <w:szCs w:val="20"/>
-                <w:color w:val="000000"/>
-              </w:rPr>
-              <w:t xml:space="preserve">0.351</w:t>
-            </w:r>
-          </w:p>
-        </w:tc>
-        <w:tc>
-          <w:tcPr>
-            <w:tcBorders>
-              <w:bottom w:val="none" w:sz="0" w:space="0" w:color="000000"/>
-              <w:top w:val="none" w:sz="0" w:space="0" w:color="000000"/>
-              <w:left w:val="none" w:sz="0" w:space="0" w:color="000000"/>
-              <w:right w:val="none" w:sz="0" w:space="0" w:color="000000"/>
-            </w:tcBorders>
-            <w:shd w:val="clear" w:color="auto" w:fill="FFFFFF"/>
-            <w:tcMar>
-              <w:top w:w="0" w:type="dxa"/>
-              <w:bottom w:w="0" w:type="dxa"/>
-              <w:left w:w="0" w:type="dxa"/>
-              <w:right w:w="0" w:type="dxa"/>
-            </w:tcMar>
-            <w:vAlign w:val="center"/>
-          </w:tcPr>
-          <w:p>
-            <w:pPr>
-              <w:pStyle w:val="Normal"/>
-              <w:jc w:val="right"/>
-              <w:pBdr>
-                <w:bottom w:val="none" w:sz="0" w:space="0" w:color="000000"/>
-                <w:top w:val="none" w:sz="0" w:space="0" w:color="000000"/>
-                <w:left w:val="none" w:sz="0" w:space="0" w:color="000000"/>
-                <w:right w:val="none" w:sz="0" w:space="0" w:color="000000"/>
-              </w:pBdr>
-              <w:spacing w:after="100" w:before="100" w:line="240"/>
-              <w:ind w:left="100" w:right="100" w:firstLine="0" w:firstLineChars="0"/>
-              <w:rPr>
-                <w:rFonts w:ascii="Calibri" w:hAnsi="Arial" w:eastAsia="Arial" w:cs="Arial"/>
-                <w:i w:val="false"/>
-                <w:b w:val="false"/>
-                <w:u w:val="none"/>
-                <w:strike w:val="false"/>
-                <w:sz w:val="20"/>
-                <w:szCs w:val="20"/>
-                <w:color w:val="000000"/>
-              </w:rPr>
-            </w:pPr>
-            <w:r>
-              <w:rPr>
-                <w:rFonts w:ascii="Calibri" w:hAnsi="Arial" w:eastAsia="Arial" w:cs="Arial"/>
-                <w:i w:val="false"/>
-                <w:b w:val="false"/>
-                <w:u w:val="none"/>
-                <w:strike w:val="false"/>
-                <w:sz w:val="20"/>
-                <w:szCs w:val="20"/>
-                <w:color w:val="000000"/>
-              </w:rPr>
-              <w:t xml:space="preserve">0.178</w:t>
-            </w:r>
-          </w:p>
-        </w:tc>
-        <w:tc>
-          <w:tcPr>
-            <w:tcBorders>
-              <w:bottom w:val="none" w:sz="0" w:space="0" w:color="000000"/>
-              <w:top w:val="none" w:sz="0" w:space="0" w:color="000000"/>
-              <w:left w:val="none" w:sz="0" w:space="0" w:color="000000"/>
-              <w:right w:val="none" w:sz="0" w:space="0" w:color="000000"/>
-            </w:tcBorders>
-            <w:shd w:val="clear" w:color="auto" w:fill="FFFFFF"/>
-            <w:tcMar>
-              <w:top w:w="0" w:type="dxa"/>
-              <w:bottom w:w="0" w:type="dxa"/>
-              <w:left w:w="0" w:type="dxa"/>
-              <w:right w:w="0" w:type="dxa"/>
-            </w:tcMar>
-            <w:vAlign w:val="center"/>
-          </w:tcPr>
-          <w:p>
-            <w:pPr>
-              <w:pStyle w:val="Normal"/>
-              <w:jc w:val="right"/>
-              <w:pBdr>
-                <w:bottom w:val="none" w:sz="0" w:space="0" w:color="000000"/>
-                <w:top w:val="none" w:sz="0" w:space="0" w:color="000000"/>
-                <w:left w:val="none" w:sz="0" w:space="0" w:color="000000"/>
-                <w:right w:val="none" w:sz="0" w:space="0" w:color="000000"/>
-              </w:pBdr>
-              <w:spacing w:after="100" w:before="100" w:line="240"/>
-              <w:ind w:left="100" w:right="100" w:firstLine="0" w:firstLineChars="0"/>
-              <w:rPr>
-                <w:rFonts w:ascii="Calibri" w:hAnsi="Arial" w:eastAsia="Arial" w:cs="Arial"/>
-                <w:i w:val="false"/>
-                <w:b w:val="false"/>
-                <w:u w:val="none"/>
-                <w:strike w:val="false"/>
-                <w:sz w:val="20"/>
-                <w:szCs w:val="20"/>
-                <w:color w:val="000000"/>
-              </w:rPr>
-            </w:pPr>
-            <w:r>
-              <w:rPr>
-                <w:rFonts w:ascii="Calibri" w:hAnsi="Arial" w:eastAsia="Arial" w:cs="Arial"/>
-                <w:i w:val="false"/>
-                <w:b w:val="false"/>
-                <w:u w:val="none"/>
-                <w:strike w:val="false"/>
-                <w:sz w:val="20"/>
-                <w:szCs w:val="20"/>
-                <w:color w:val="000000"/>
-              </w:rPr>
-              <w:t xml:space="preserve">0.122</w:t>
-            </w:r>
-          </w:p>
-        </w:tc>
-        <w:tc>
-          <w:tcPr>
-            <w:tcBorders>
-              <w:bottom w:val="none" w:sz="0" w:space="0" w:color="000000"/>
-              <w:top w:val="none" w:sz="0" w:space="0" w:color="000000"/>
-              <w:left w:val="none" w:sz="0" w:space="0" w:color="000000"/>
-              <w:right w:val="none" w:sz="0" w:space="0" w:color="000000"/>
-            </w:tcBorders>
-            <w:shd w:val="clear" w:color="auto" w:fill="FFFFFF"/>
-            <w:tcMar>
-              <w:top w:w="0" w:type="dxa"/>
-              <w:bottom w:w="0" w:type="dxa"/>
-              <w:left w:w="0" w:type="dxa"/>
-              <w:right w:w="0" w:type="dxa"/>
-            </w:tcMar>
-            <w:vAlign w:val="center"/>
-          </w:tcPr>
-          <w:p>
-            <w:pPr>
-              <w:pStyle w:val="Normal"/>
-              <w:jc w:val="right"/>
-              <w:pBdr>
-                <w:bottom w:val="none" w:sz="0" w:space="0" w:color="000000"/>
-                <w:top w:val="none" w:sz="0" w:space="0" w:color="000000"/>
-                <w:left w:val="none" w:sz="0" w:space="0" w:color="000000"/>
-                <w:right w:val="none" w:sz="0" w:space="0" w:color="000000"/>
-              </w:pBdr>
-              <w:spacing w:after="100" w:before="100" w:line="240"/>
-              <w:ind w:left="100" w:right="100" w:firstLine="0" w:firstLineChars="0"/>
-              <w:rPr>
-                <w:rFonts w:ascii="Calibri" w:hAnsi="Arial" w:eastAsia="Arial" w:cs="Arial"/>
-                <w:i w:val="false"/>
-                <w:b w:val="false"/>
-                <w:u w:val="none"/>
-                <w:strike w:val="false"/>
-                <w:sz w:val="20"/>
-                <w:szCs w:val="20"/>
-                <w:color w:val="000000"/>
-              </w:rPr>
-            </w:pPr>
-            <w:r>
-              <w:rPr>
-                <w:rFonts w:ascii="Calibri" w:hAnsi="Arial" w:eastAsia="Arial" w:cs="Arial"/>
-                <w:i w:val="false"/>
-                <w:b w:val="false"/>
-                <w:u w:val="none"/>
-                <w:strike w:val="false"/>
-                <w:sz w:val="20"/>
-                <w:szCs w:val="20"/>
-                <w:color w:val="000000"/>
-              </w:rPr>
-              <w:t xml:space="preserve">0.000</w:t>
-            </w:r>
-          </w:p>
-        </w:tc>
-      </w:tr>
-      <w:tr>
-        <w:trPr>
-          <w:trHeight w:val="541" w:hRule="auto"/>
-        </w:trPr>
-        <w:tc>
-          <w:tcPr>
-            <w:tcBorders>
               <w:bottom w:val="single" w:sz="12" w:space="0" w:color="666666"/>
               <w:top w:val="none" w:sz="0" w:space="0" w:color="000000"/>
               <w:left w:val="none" w:sz="0" w:space="0" w:color="000000"/>
@@ -1821,7 +2381,7 @@
                 <w:szCs w:val="20"/>
                 <w:color w:val="000000"/>
               </w:rPr>
-              <w:t xml:space="preserve">2SRR-FAVAR</w:t>
+              <w:t xml:space="preserve">AR</w:t>
             </w:r>
           </w:p>
         </w:tc>
@@ -1876,7 +2436,7 @@
                 <w:szCs w:val="20"/>
                 <w:color w:val="000000"/>
               </w:rPr>
-              <w:t xml:space="preserve">0.000</w:t>
+              <w:t xml:space="preserve">0.306</w:t>
             </w:r>
           </w:p>
         </w:tc>
@@ -1931,7 +2491,7 @@
                 <w:szCs w:val="20"/>
                 <w:color w:val="000000"/>
               </w:rPr>
-              <w:t xml:space="preserve">0.008</w:t>
+              <w:t xml:space="preserve">0.241</w:t>
             </w:r>
           </w:p>
         </w:tc>
@@ -1986,7 +2546,7 @@
                 <w:szCs w:val="20"/>
                 <w:color w:val="000000"/>
               </w:rPr>
-              <w:t xml:space="preserve">0.011</w:t>
+              <w:t xml:space="preserve">0.405</w:t>
             </w:r>
           </w:p>
         </w:tc>
@@ -2041,7 +2601,7 @@
                 <w:szCs w:val="20"/>
                 <w:color w:val="000000"/>
               </w:rPr>
-              <w:t xml:space="preserve">0.000</w:t>
+              <w:t xml:space="preserve">0.137</w:t>
             </w:r>
           </w:p>
         </w:tc>

</xml_diff>